<commit_message>
Update project report DOCX and PDF drafts
</commit_message>
<xml_diff>
--- a/reports_and_docs/Python Report Final Draft.docx
+++ b/reports_and_docs/Python Report Final Draft.docx
@@ -560,7 +560,7 @@
           <w:lang w:val="en-US"/>
           <w14:ligatures w14:val="none"/>
         </w:rPr>
-        <w:t>26MCD100</w:t>
+        <w:t>26MCD10006</w:t>
       </w:r>
       <w:r>
         <w:rPr>
@@ -572,7 +572,7 @@
           <w:lang w:val="en-US"/>
           <w14:ligatures w14:val="none"/>
         </w:rPr>
-        <w:t>06</w:t>
+        <w:tab/>
       </w:r>
       <w:r>
         <w:rPr>
@@ -653,18 +653,6 @@
           <w:kern w:val="0"/>
           <w:sz w:val="28"/>
           <w:szCs w:val="28"/>
-          <w:lang w:val="en-US"/>
-          <w14:ligatures w14:val="none"/>
-        </w:rPr>
-        <w:tab/>
-      </w:r>
-      <w:r>
-        <w:rPr>
-          <w:rFonts w:ascii="Times New Roman" w:eastAsia="MS Mincho" w:hAnsi="Times New Roman" w:cs="Times New Roman"/>
-          <w:color w:val="000000" w:themeColor="text1"/>
-          <w:kern w:val="0"/>
-          <w:sz w:val="28"/>
-          <w:szCs w:val="28"/>
           <w14:ligatures w14:val="none"/>
         </w:rPr>
         <w:t>E2916</w:t>
@@ -694,31 +682,7 @@
           <w:lang w:val="en-US"/>
           <w14:ligatures w14:val="none"/>
         </w:rPr>
-        <w:t>MCA</w:t>
-      </w:r>
-      <w:r>
-        <w:rPr>
-          <w:rFonts w:ascii="Times New Roman" w:eastAsia="MS Mincho" w:hAnsi="Times New Roman" w:cs="Times New Roman"/>
-          <w:color w:val="000000" w:themeColor="text1"/>
-          <w:kern w:val="0"/>
-          <w:sz w:val="28"/>
-          <w:szCs w:val="28"/>
-          <w:lang w:val="en-US"/>
-          <w14:ligatures w14:val="none"/>
-        </w:rPr>
-        <w:t xml:space="preserve"> </w:t>
-      </w:r>
-      <w:r>
-        <w:rPr>
-          <w:rFonts w:ascii="Times New Roman" w:eastAsia="MS Mincho" w:hAnsi="Times New Roman" w:cs="Times New Roman"/>
-          <w:color w:val="000000" w:themeColor="text1"/>
-          <w:kern w:val="0"/>
-          <w:sz w:val="28"/>
-          <w:szCs w:val="28"/>
-          <w:lang w:val="en-US"/>
-          <w14:ligatures w14:val="none"/>
-        </w:rPr>
-        <w:t xml:space="preserve">(Data Science)    </w:t>
+        <w:t xml:space="preserve">MCA (Data Science)    </w:t>
       </w:r>
       <w:r>
         <w:rPr>
@@ -1132,22 +1096,24 @@
     <w:tbl>
       <w:tblPr>
         <w:tblStyle w:val="TableGrid1"/>
-        <w:tblW w:w="0" w:type="auto"/>
+        <w:tblW w:w="9258" w:type="dxa"/>
         <w:jc w:val="center"/>
         <w:tblLook w:val="04A0" w:firstRow="1" w:lastRow="0" w:firstColumn="1" w:lastColumn="0" w:noHBand="0" w:noVBand="1"/>
       </w:tblPr>
       <w:tblGrid>
-        <w:gridCol w:w="1026"/>
-        <w:gridCol w:w="4119"/>
-        <w:gridCol w:w="1425"/>
+        <w:gridCol w:w="1446"/>
+        <w:gridCol w:w="5804"/>
+        <w:gridCol w:w="2008"/>
       </w:tblGrid>
       <w:tr>
         <w:trPr>
+          <w:trHeight w:val="500"/>
           <w:jc w:val="center"/>
         </w:trPr>
         <w:tc>
           <w:tcPr>
             <w:tcW w:w="0" w:type="auto"/>
+            <w:vAlign w:val="center"/>
             <w:hideMark/>
           </w:tcPr>
           <w:p>
@@ -1181,6 +1147,7 @@
         <w:tc>
           <w:tcPr>
             <w:tcW w:w="0" w:type="auto"/>
+            <w:vAlign w:val="center"/>
             <w:hideMark/>
           </w:tcPr>
           <w:p>
@@ -1214,6 +1181,7 @@
         <w:tc>
           <w:tcPr>
             <w:tcW w:w="0" w:type="auto"/>
+            <w:vAlign w:val="center"/>
             <w:hideMark/>
           </w:tcPr>
           <w:p>
@@ -1247,11 +1215,13 @@
       </w:tr>
       <w:tr>
         <w:trPr>
+          <w:trHeight w:val="488"/>
           <w:jc w:val="center"/>
         </w:trPr>
         <w:tc>
           <w:tcPr>
             <w:tcW w:w="0" w:type="auto"/>
+            <w:vAlign w:val="center"/>
             <w:hideMark/>
           </w:tcPr>
           <w:p>
@@ -1283,6 +1253,7 @@
         <w:tc>
           <w:tcPr>
             <w:tcW w:w="0" w:type="auto"/>
+            <w:vAlign w:val="center"/>
             <w:hideMark/>
           </w:tcPr>
           <w:p>
@@ -1314,6 +1285,7 @@
         <w:tc>
           <w:tcPr>
             <w:tcW w:w="0" w:type="auto"/>
+            <w:vAlign w:val="center"/>
             <w:hideMark/>
           </w:tcPr>
           <w:p>
@@ -1338,18 +1310,20 @@
                 <w:szCs w:val="32"/>
                 <w:lang w:val="en-IN"/>
               </w:rPr>
-              <w:t>1</w:t>
+              <w:t>2</w:t>
             </w:r>
           </w:p>
         </w:tc>
       </w:tr>
       <w:tr>
         <w:trPr>
+          <w:trHeight w:val="488"/>
           <w:jc w:val="center"/>
         </w:trPr>
         <w:tc>
           <w:tcPr>
             <w:tcW w:w="0" w:type="auto"/>
+            <w:vAlign w:val="center"/>
             <w:hideMark/>
           </w:tcPr>
           <w:p>
@@ -1381,6 +1355,7 @@
         <w:tc>
           <w:tcPr>
             <w:tcW w:w="0" w:type="auto"/>
+            <w:vAlign w:val="center"/>
             <w:hideMark/>
           </w:tcPr>
           <w:p>
@@ -1412,6 +1387,7 @@
         <w:tc>
           <w:tcPr>
             <w:tcW w:w="0" w:type="auto"/>
+            <w:vAlign w:val="center"/>
             <w:hideMark/>
           </w:tcPr>
           <w:p>
@@ -1443,11 +1419,13 @@
       </w:tr>
       <w:tr>
         <w:trPr>
+          <w:trHeight w:val="500"/>
           <w:jc w:val="center"/>
         </w:trPr>
         <w:tc>
           <w:tcPr>
             <w:tcW w:w="0" w:type="auto"/>
+            <w:vAlign w:val="center"/>
             <w:hideMark/>
           </w:tcPr>
           <w:p>
@@ -1479,6 +1457,7 @@
         <w:tc>
           <w:tcPr>
             <w:tcW w:w="0" w:type="auto"/>
+            <w:vAlign w:val="center"/>
             <w:hideMark/>
           </w:tcPr>
           <w:p>
@@ -1510,6 +1489,7 @@
         <w:tc>
           <w:tcPr>
             <w:tcW w:w="0" w:type="auto"/>
+            <w:vAlign w:val="center"/>
             <w:hideMark/>
           </w:tcPr>
           <w:p>
@@ -1541,11 +1521,13 @@
       </w:tr>
       <w:tr>
         <w:trPr>
+          <w:trHeight w:val="488"/>
           <w:jc w:val="center"/>
         </w:trPr>
         <w:tc>
           <w:tcPr>
             <w:tcW w:w="0" w:type="auto"/>
+            <w:vAlign w:val="center"/>
             <w:hideMark/>
           </w:tcPr>
           <w:p>
@@ -1577,6 +1559,7 @@
         <w:tc>
           <w:tcPr>
             <w:tcW w:w="0" w:type="auto"/>
+            <w:vAlign w:val="center"/>
             <w:hideMark/>
           </w:tcPr>
           <w:p>
@@ -1608,6 +1591,7 @@
         <w:tc>
           <w:tcPr>
             <w:tcW w:w="0" w:type="auto"/>
+            <w:vAlign w:val="center"/>
             <w:hideMark/>
           </w:tcPr>
           <w:p>
@@ -1632,18 +1616,20 @@
                 <w:szCs w:val="32"/>
                 <w:lang w:val="en-IN"/>
               </w:rPr>
-              <w:t>4</w:t>
+              <w:t>3</w:t>
             </w:r>
           </w:p>
         </w:tc>
       </w:tr>
       <w:tr>
         <w:trPr>
+          <w:trHeight w:val="488"/>
           <w:jc w:val="center"/>
         </w:trPr>
         <w:tc>
           <w:tcPr>
             <w:tcW w:w="0" w:type="auto"/>
+            <w:vAlign w:val="center"/>
             <w:hideMark/>
           </w:tcPr>
           <w:p>
@@ -1675,6 +1661,7 @@
         <w:tc>
           <w:tcPr>
             <w:tcW w:w="0" w:type="auto"/>
+            <w:vAlign w:val="center"/>
             <w:hideMark/>
           </w:tcPr>
           <w:p>
@@ -1706,6 +1693,7 @@
         <w:tc>
           <w:tcPr>
             <w:tcW w:w="0" w:type="auto"/>
+            <w:vAlign w:val="center"/>
             <w:hideMark/>
           </w:tcPr>
           <w:p>
@@ -1730,18 +1718,20 @@
                 <w:szCs w:val="32"/>
                 <w:lang w:val="en-IN"/>
               </w:rPr>
-              <w:t>5</w:t>
+              <w:t>4</w:t>
             </w:r>
           </w:p>
         </w:tc>
       </w:tr>
       <w:tr>
         <w:trPr>
+          <w:trHeight w:val="488"/>
           <w:jc w:val="center"/>
         </w:trPr>
         <w:tc>
           <w:tcPr>
             <w:tcW w:w="0" w:type="auto"/>
+            <w:vAlign w:val="center"/>
             <w:hideMark/>
           </w:tcPr>
           <w:p>
@@ -1773,6 +1763,7 @@
         <w:tc>
           <w:tcPr>
             <w:tcW w:w="0" w:type="auto"/>
+            <w:vAlign w:val="center"/>
             <w:hideMark/>
           </w:tcPr>
           <w:p>
@@ -1804,6 +1795,7 @@
         <w:tc>
           <w:tcPr>
             <w:tcW w:w="0" w:type="auto"/>
+            <w:vAlign w:val="center"/>
             <w:hideMark/>
           </w:tcPr>
           <w:p>
@@ -1828,18 +1820,20 @@
                 <w:szCs w:val="32"/>
                 <w:lang w:val="en-IN"/>
               </w:rPr>
-              <w:t>5</w:t>
+              <w:t>4</w:t>
             </w:r>
           </w:p>
         </w:tc>
       </w:tr>
       <w:tr>
         <w:trPr>
+          <w:trHeight w:val="500"/>
           <w:jc w:val="center"/>
         </w:trPr>
         <w:tc>
           <w:tcPr>
             <w:tcW w:w="0" w:type="auto"/>
+            <w:vAlign w:val="center"/>
             <w:hideMark/>
           </w:tcPr>
           <w:p>
@@ -1871,6 +1865,7 @@
         <w:tc>
           <w:tcPr>
             <w:tcW w:w="0" w:type="auto"/>
+            <w:vAlign w:val="center"/>
             <w:hideMark/>
           </w:tcPr>
           <w:p>
@@ -1902,6 +1897,7 @@
         <w:tc>
           <w:tcPr>
             <w:tcW w:w="0" w:type="auto"/>
+            <w:vAlign w:val="center"/>
             <w:hideMark/>
           </w:tcPr>
           <w:p>
@@ -1926,18 +1922,20 @@
                 <w:szCs w:val="32"/>
                 <w:lang w:val="en-IN"/>
               </w:rPr>
-              <w:t>5</w:t>
+              <w:t>4</w:t>
             </w:r>
           </w:p>
         </w:tc>
       </w:tr>
       <w:tr>
         <w:trPr>
+          <w:trHeight w:val="488"/>
           <w:jc w:val="center"/>
         </w:trPr>
         <w:tc>
           <w:tcPr>
             <w:tcW w:w="0" w:type="auto"/>
+            <w:vAlign w:val="center"/>
             <w:hideMark/>
           </w:tcPr>
           <w:p>
@@ -1969,6 +1967,7 @@
         <w:tc>
           <w:tcPr>
             <w:tcW w:w="0" w:type="auto"/>
+            <w:vAlign w:val="center"/>
             <w:hideMark/>
           </w:tcPr>
           <w:p>
@@ -2000,6 +1999,7 @@
         <w:tc>
           <w:tcPr>
             <w:tcW w:w="0" w:type="auto"/>
+            <w:vAlign w:val="center"/>
             <w:hideMark/>
           </w:tcPr>
           <w:p>
@@ -2024,18 +2024,20 @@
                 <w:szCs w:val="32"/>
                 <w:lang w:val="en-IN"/>
               </w:rPr>
-              <w:t>6</w:t>
+              <w:t>4</w:t>
             </w:r>
           </w:p>
         </w:tc>
       </w:tr>
       <w:tr>
         <w:trPr>
+          <w:trHeight w:val="488"/>
           <w:jc w:val="center"/>
         </w:trPr>
         <w:tc>
           <w:tcPr>
             <w:tcW w:w="0" w:type="auto"/>
+            <w:vAlign w:val="center"/>
             <w:hideMark/>
           </w:tcPr>
           <w:p>
@@ -2067,6 +2069,7 @@
         <w:tc>
           <w:tcPr>
             <w:tcW w:w="0" w:type="auto"/>
+            <w:vAlign w:val="center"/>
             <w:hideMark/>
           </w:tcPr>
           <w:p>
@@ -2098,6 +2101,7 @@
         <w:tc>
           <w:tcPr>
             <w:tcW w:w="0" w:type="auto"/>
+            <w:vAlign w:val="center"/>
             <w:hideMark/>
           </w:tcPr>
           <w:p>
@@ -2122,18 +2126,20 @@
                 <w:szCs w:val="32"/>
                 <w:lang w:val="en-IN"/>
               </w:rPr>
-              <w:t>6</w:t>
+              <w:t>5</w:t>
             </w:r>
           </w:p>
         </w:tc>
       </w:tr>
       <w:tr>
         <w:trPr>
+          <w:trHeight w:val="500"/>
           <w:jc w:val="center"/>
         </w:trPr>
         <w:tc>
           <w:tcPr>
             <w:tcW w:w="0" w:type="auto"/>
+            <w:vAlign w:val="center"/>
             <w:hideMark/>
           </w:tcPr>
           <w:p>
@@ -2165,6 +2171,7 @@
         <w:tc>
           <w:tcPr>
             <w:tcW w:w="0" w:type="auto"/>
+            <w:vAlign w:val="center"/>
             <w:hideMark/>
           </w:tcPr>
           <w:p>
@@ -2196,6 +2203,7 @@
         <w:tc>
           <w:tcPr>
             <w:tcW w:w="0" w:type="auto"/>
+            <w:vAlign w:val="center"/>
             <w:hideMark/>
           </w:tcPr>
           <w:p>
@@ -2220,18 +2228,20 @@
                 <w:szCs w:val="32"/>
                 <w:lang w:val="en-IN"/>
               </w:rPr>
-              <w:t>6</w:t>
+              <w:t>5</w:t>
             </w:r>
           </w:p>
         </w:tc>
       </w:tr>
       <w:tr>
         <w:trPr>
+          <w:trHeight w:val="488"/>
           <w:jc w:val="center"/>
         </w:trPr>
         <w:tc>
           <w:tcPr>
             <w:tcW w:w="0" w:type="auto"/>
+            <w:vAlign w:val="center"/>
             <w:hideMark/>
           </w:tcPr>
           <w:p>
@@ -2263,6 +2273,7 @@
         <w:tc>
           <w:tcPr>
             <w:tcW w:w="0" w:type="auto"/>
+            <w:vAlign w:val="center"/>
             <w:hideMark/>
           </w:tcPr>
           <w:p>
@@ -2294,6 +2305,7 @@
         <w:tc>
           <w:tcPr>
             <w:tcW w:w="0" w:type="auto"/>
+            <w:vAlign w:val="center"/>
             <w:hideMark/>
           </w:tcPr>
           <w:p>
@@ -2318,18 +2330,20 @@
                 <w:szCs w:val="32"/>
                 <w:lang w:val="en-IN"/>
               </w:rPr>
-              <w:t>7</w:t>
+              <w:t>5–6</w:t>
             </w:r>
           </w:p>
         </w:tc>
       </w:tr>
       <w:tr>
         <w:trPr>
+          <w:trHeight w:val="488"/>
           <w:jc w:val="center"/>
         </w:trPr>
         <w:tc>
           <w:tcPr>
             <w:tcW w:w="0" w:type="auto"/>
+            <w:vAlign w:val="center"/>
             <w:hideMark/>
           </w:tcPr>
           <w:p>
@@ -2361,6 +2375,7 @@
         <w:tc>
           <w:tcPr>
             <w:tcW w:w="0" w:type="auto"/>
+            <w:vAlign w:val="center"/>
             <w:hideMark/>
           </w:tcPr>
           <w:p>
@@ -2392,6 +2407,7 @@
         <w:tc>
           <w:tcPr>
             <w:tcW w:w="0" w:type="auto"/>
+            <w:vAlign w:val="center"/>
             <w:hideMark/>
           </w:tcPr>
           <w:p>
@@ -2416,18 +2432,20 @@
                 <w:szCs w:val="32"/>
                 <w:lang w:val="en-IN"/>
               </w:rPr>
-              <w:t>8</w:t>
+              <w:t>6–7</w:t>
             </w:r>
           </w:p>
         </w:tc>
       </w:tr>
       <w:tr>
         <w:trPr>
+          <w:trHeight w:val="488"/>
           <w:jc w:val="center"/>
         </w:trPr>
         <w:tc>
           <w:tcPr>
             <w:tcW w:w="0" w:type="auto"/>
+            <w:vAlign w:val="center"/>
             <w:hideMark/>
           </w:tcPr>
           <w:p>
@@ -2459,6 +2477,7 @@
         <w:tc>
           <w:tcPr>
             <w:tcW w:w="0" w:type="auto"/>
+            <w:vAlign w:val="center"/>
             <w:hideMark/>
           </w:tcPr>
           <w:p>
@@ -2490,6 +2509,7 @@
         <w:tc>
           <w:tcPr>
             <w:tcW w:w="0" w:type="auto"/>
+            <w:vAlign w:val="center"/>
             <w:hideMark/>
           </w:tcPr>
           <w:p>
@@ -2514,18 +2534,20 @@
                 <w:szCs w:val="32"/>
                 <w:lang w:val="en-IN"/>
               </w:rPr>
-              <w:t>9</w:t>
+              <w:t>7</w:t>
             </w:r>
           </w:p>
         </w:tc>
       </w:tr>
       <w:tr>
         <w:trPr>
+          <w:trHeight w:val="500"/>
           <w:jc w:val="center"/>
         </w:trPr>
         <w:tc>
           <w:tcPr>
             <w:tcW w:w="0" w:type="auto"/>
+            <w:vAlign w:val="center"/>
             <w:hideMark/>
           </w:tcPr>
           <w:p>
@@ -2557,6 +2579,7 @@
         <w:tc>
           <w:tcPr>
             <w:tcW w:w="0" w:type="auto"/>
+            <w:vAlign w:val="center"/>
             <w:hideMark/>
           </w:tcPr>
           <w:p>
@@ -2588,6 +2611,7 @@
         <w:tc>
           <w:tcPr>
             <w:tcW w:w="0" w:type="auto"/>
+            <w:vAlign w:val="center"/>
             <w:hideMark/>
           </w:tcPr>
           <w:p>
@@ -2612,18 +2636,20 @@
                 <w:szCs w:val="32"/>
                 <w:lang w:val="en-IN"/>
               </w:rPr>
-              <w:t>9</w:t>
+              <w:t>7</w:t>
             </w:r>
           </w:p>
         </w:tc>
       </w:tr>
       <w:tr>
         <w:trPr>
+          <w:trHeight w:val="488"/>
           <w:jc w:val="center"/>
         </w:trPr>
         <w:tc>
           <w:tcPr>
             <w:tcW w:w="0" w:type="auto"/>
+            <w:vAlign w:val="center"/>
             <w:hideMark/>
           </w:tcPr>
           <w:p>
@@ -2655,6 +2681,7 @@
         <w:tc>
           <w:tcPr>
             <w:tcW w:w="0" w:type="auto"/>
+            <w:vAlign w:val="center"/>
             <w:hideMark/>
           </w:tcPr>
           <w:p>
@@ -2686,6 +2713,7 @@
         <w:tc>
           <w:tcPr>
             <w:tcW w:w="0" w:type="auto"/>
+            <w:vAlign w:val="center"/>
             <w:hideMark/>
           </w:tcPr>
           <w:p>
@@ -2710,18 +2738,20 @@
                 <w:szCs w:val="32"/>
                 <w:lang w:val="en-IN"/>
               </w:rPr>
-              <w:t>10</w:t>
+              <w:t>7</w:t>
             </w:r>
           </w:p>
         </w:tc>
       </w:tr>
       <w:tr>
         <w:trPr>
+          <w:trHeight w:val="488"/>
           <w:jc w:val="center"/>
         </w:trPr>
         <w:tc>
           <w:tcPr>
             <w:tcW w:w="0" w:type="auto"/>
+            <w:vAlign w:val="center"/>
             <w:hideMark/>
           </w:tcPr>
           <w:p>
@@ -2753,6 +2783,7 @@
         <w:tc>
           <w:tcPr>
             <w:tcW w:w="0" w:type="auto"/>
+            <w:vAlign w:val="center"/>
             <w:hideMark/>
           </w:tcPr>
           <w:p>
@@ -2784,6 +2815,7 @@
         <w:tc>
           <w:tcPr>
             <w:tcW w:w="0" w:type="auto"/>
+            <w:vAlign w:val="center"/>
             <w:hideMark/>
           </w:tcPr>
           <w:p>
@@ -2808,18 +2840,20 @@
                 <w:szCs w:val="32"/>
                 <w:lang w:val="en-IN"/>
               </w:rPr>
-              <w:t>11</w:t>
+              <w:t>8–11</w:t>
             </w:r>
           </w:p>
         </w:tc>
       </w:tr>
       <w:tr>
         <w:trPr>
+          <w:trHeight w:val="500"/>
           <w:jc w:val="center"/>
         </w:trPr>
         <w:tc>
           <w:tcPr>
             <w:tcW w:w="0" w:type="auto"/>
+            <w:vAlign w:val="center"/>
             <w:hideMark/>
           </w:tcPr>
           <w:p>
@@ -2851,6 +2885,7 @@
         <w:tc>
           <w:tcPr>
             <w:tcW w:w="0" w:type="auto"/>
+            <w:vAlign w:val="center"/>
             <w:hideMark/>
           </w:tcPr>
           <w:p>
@@ -2882,6 +2917,7 @@
         <w:tc>
           <w:tcPr>
             <w:tcW w:w="0" w:type="auto"/>
+            <w:vAlign w:val="center"/>
             <w:hideMark/>
           </w:tcPr>
           <w:p>
@@ -2906,18 +2942,20 @@
                 <w:szCs w:val="32"/>
                 <w:lang w:val="en-IN"/>
               </w:rPr>
-              <w:t>13</w:t>
+              <w:t>12</w:t>
             </w:r>
           </w:p>
         </w:tc>
       </w:tr>
       <w:tr>
         <w:trPr>
+          <w:trHeight w:val="488"/>
           <w:jc w:val="center"/>
         </w:trPr>
         <w:tc>
           <w:tcPr>
             <w:tcW w:w="0" w:type="auto"/>
+            <w:vAlign w:val="center"/>
             <w:hideMark/>
           </w:tcPr>
           <w:p>
@@ -2949,6 +2987,7 @@
         <w:tc>
           <w:tcPr>
             <w:tcW w:w="0" w:type="auto"/>
+            <w:vAlign w:val="center"/>
             <w:hideMark/>
           </w:tcPr>
           <w:p>
@@ -2980,6 +3019,7 @@
         <w:tc>
           <w:tcPr>
             <w:tcW w:w="0" w:type="auto"/>
+            <w:vAlign w:val="center"/>
             <w:hideMark/>
           </w:tcPr>
           <w:p>
@@ -3004,18 +3044,20 @@
                 <w:szCs w:val="32"/>
                 <w:lang w:val="en-IN"/>
               </w:rPr>
-              <w:t>14</w:t>
+              <w:t>12–14</w:t>
             </w:r>
           </w:p>
         </w:tc>
       </w:tr>
       <w:tr>
         <w:trPr>
+          <w:trHeight w:val="488"/>
           <w:jc w:val="center"/>
         </w:trPr>
         <w:tc>
           <w:tcPr>
             <w:tcW w:w="0" w:type="auto"/>
+            <w:vAlign w:val="center"/>
             <w:hideMark/>
           </w:tcPr>
           <w:p>
@@ -3047,6 +3089,7 @@
         <w:tc>
           <w:tcPr>
             <w:tcW w:w="0" w:type="auto"/>
+            <w:vAlign w:val="center"/>
             <w:hideMark/>
           </w:tcPr>
           <w:p>
@@ -3078,6 +3121,7 @@
         <w:tc>
           <w:tcPr>
             <w:tcW w:w="0" w:type="auto"/>
+            <w:vAlign w:val="center"/>
             <w:hideMark/>
           </w:tcPr>
           <w:p>
@@ -3102,18 +3146,20 @@
                 <w:szCs w:val="32"/>
                 <w:lang w:val="en-IN"/>
               </w:rPr>
-              <w:t>17</w:t>
+              <w:t>14</w:t>
             </w:r>
           </w:p>
         </w:tc>
       </w:tr>
       <w:tr>
         <w:trPr>
+          <w:trHeight w:val="500"/>
           <w:jc w:val="center"/>
         </w:trPr>
         <w:tc>
           <w:tcPr>
             <w:tcW w:w="0" w:type="auto"/>
+            <w:vAlign w:val="center"/>
             <w:hideMark/>
           </w:tcPr>
           <w:p>
@@ -3145,6 +3191,7 @@
         <w:tc>
           <w:tcPr>
             <w:tcW w:w="0" w:type="auto"/>
+            <w:vAlign w:val="center"/>
             <w:hideMark/>
           </w:tcPr>
           <w:p>
@@ -3176,6 +3223,7 @@
         <w:tc>
           <w:tcPr>
             <w:tcW w:w="0" w:type="auto"/>
+            <w:vAlign w:val="center"/>
             <w:hideMark/>
           </w:tcPr>
           <w:p>
@@ -3200,7 +3248,7 @@
                 <w:szCs w:val="32"/>
                 <w:lang w:val="en-IN"/>
               </w:rPr>
-              <w:t>18</w:t>
+              <w:t>14–15</w:t>
             </w:r>
           </w:p>
         </w:tc>
@@ -3224,20 +3272,6 @@
     </w:p>
     <w:p>
       <w:pPr>
-        <w:spacing w:after="0" w:line="276" w:lineRule="auto"/>
-        <w:jc w:val="center"/>
-        <w:rPr>
-          <w:rFonts w:ascii="Times New Roman" w:eastAsia="MS Mincho" w:hAnsi="Times New Roman" w:cs="Times New Roman"/>
-          <w:b/>
-          <w:color w:val="000000" w:themeColor="text1"/>
-          <w:kern w:val="0"/>
-          <w:lang w:val="en-US"/>
-          <w14:ligatures w14:val="none"/>
-        </w:rPr>
-      </w:pPr>
-    </w:p>
-    <w:p>
-      <w:pPr>
         <w:spacing w:after="200" w:line="276" w:lineRule="auto"/>
         <w:jc w:val="center"/>
         <w:rPr>
@@ -3283,6 +3317,404 @@
           <w14:ligatures w14:val="none"/>
         </w:rPr>
       </w:pPr>
+      <w:r>
+        <w:rPr>
+          <w:rFonts w:ascii="Times New Roman" w:eastAsia="MS Mincho" w:hAnsi="Times New Roman" w:cs="Times New Roman"/>
+          <w:b/>
+          <w:color w:val="000000" w:themeColor="text1"/>
+          <w:kern w:val="0"/>
+          <w:sz w:val="32"/>
+          <w:szCs w:val="22"/>
+          <w:lang w:val="en-US"/>
+          <w14:ligatures w14:val="none"/>
+        </w:rPr>
+        <w:lastRenderedPageBreak/>
+        <w:t>CERTIFICATE</w:t>
+      </w:r>
+    </w:p>
+    <w:p>
+      <w:pPr>
+        <w:spacing w:after="200" w:line="276" w:lineRule="auto"/>
+        <w:jc w:val="both"/>
+        <w:rPr>
+          <w:rFonts w:ascii="Times New Roman" w:eastAsia="MS Mincho" w:hAnsi="Times New Roman" w:cs="Times New Roman"/>
+          <w:color w:val="000000" w:themeColor="text1"/>
+          <w:kern w:val="0"/>
+          <w:sz w:val="22"/>
+          <w:szCs w:val="22"/>
+          <w14:ligatures w14:val="none"/>
+        </w:rPr>
+      </w:pPr>
+      <w:r>
+        <w:rPr>
+          <w:rFonts w:ascii="Times New Roman" w:eastAsia="MS Mincho" w:hAnsi="Times New Roman" w:cs="Times New Roman"/>
+          <w:color w:val="000000" w:themeColor="text1"/>
+          <w:kern w:val="0"/>
+          <w:sz w:val="22"/>
+          <w:szCs w:val="22"/>
+          <w14:ligatures w14:val="none"/>
+        </w:rPr>
+        <w:t xml:space="preserve">This is to certify that </w:t>
+      </w:r>
+      <w:r>
+        <w:rPr>
+          <w:rFonts w:ascii="Times New Roman" w:eastAsia="MS Mincho" w:hAnsi="Times New Roman" w:cs="Times New Roman"/>
+          <w:b/>
+          <w:bCs/>
+          <w:color w:val="000000" w:themeColor="text1"/>
+          <w:kern w:val="0"/>
+          <w:sz w:val="22"/>
+          <w:szCs w:val="22"/>
+          <w14:ligatures w14:val="none"/>
+        </w:rPr>
+        <w:t>Arpit Saxena</w:t>
+      </w:r>
+      <w:r>
+        <w:rPr>
+          <w:rFonts w:ascii="Times New Roman" w:eastAsia="MS Mincho" w:hAnsi="Times New Roman" w:cs="Times New Roman"/>
+          <w:color w:val="000000" w:themeColor="text1"/>
+          <w:kern w:val="0"/>
+          <w:sz w:val="22"/>
+          <w:szCs w:val="22"/>
+          <w14:ligatures w14:val="none"/>
+        </w:rPr>
+        <w:t xml:space="preserve">, a student of </w:t>
+      </w:r>
+      <w:r>
+        <w:rPr>
+          <w:rFonts w:ascii="Times New Roman" w:eastAsia="MS Mincho" w:hAnsi="Times New Roman" w:cs="Times New Roman"/>
+          <w:b/>
+          <w:bCs/>
+          <w:color w:val="000000" w:themeColor="text1"/>
+          <w:kern w:val="0"/>
+          <w:sz w:val="22"/>
+          <w:szCs w:val="22"/>
+          <w14:ligatures w14:val="none"/>
+        </w:rPr>
+        <w:t>Master of Computer Applications (MCA) – Data Science, 1st Semester</w:t>
+      </w:r>
+      <w:r>
+        <w:rPr>
+          <w:rFonts w:ascii="Times New Roman" w:eastAsia="MS Mincho" w:hAnsi="Times New Roman" w:cs="Times New Roman"/>
+          <w:color w:val="000000" w:themeColor="text1"/>
+          <w:kern w:val="0"/>
+          <w:sz w:val="22"/>
+          <w:szCs w:val="22"/>
+          <w14:ligatures w14:val="none"/>
+        </w:rPr>
+        <w:t xml:space="preserve">, at Chandigarh University, Mohali, has successfully completed the mini-project entitled </w:t>
+      </w:r>
+      <w:r>
+        <w:rPr>
+          <w:rFonts w:ascii="Times New Roman" w:eastAsia="MS Mincho" w:hAnsi="Times New Roman" w:cs="Times New Roman"/>
+          <w:b/>
+          <w:bCs/>
+          <w:color w:val="000000" w:themeColor="text1"/>
+          <w:kern w:val="0"/>
+          <w:sz w:val="22"/>
+          <w:szCs w:val="22"/>
+          <w14:ligatures w14:val="none"/>
+        </w:rPr>
+        <w:t>“Personal Finance and Expense Analytics System”</w:t>
+      </w:r>
+      <w:r>
+        <w:rPr>
+          <w:rFonts w:ascii="Times New Roman" w:eastAsia="MS Mincho" w:hAnsi="Times New Roman" w:cs="Times New Roman"/>
+          <w:color w:val="000000" w:themeColor="text1"/>
+          <w:kern w:val="0"/>
+          <w:sz w:val="22"/>
+          <w:szCs w:val="22"/>
+          <w14:ligatures w14:val="none"/>
+        </w:rPr>
+        <w:t xml:space="preserve"> as part of the academic requirements for the </w:t>
+      </w:r>
+      <w:r>
+        <w:rPr>
+          <w:rFonts w:ascii="Times New Roman" w:eastAsia="MS Mincho" w:hAnsi="Times New Roman" w:cs="Times New Roman"/>
+          <w:b/>
+          <w:bCs/>
+          <w:color w:val="000000" w:themeColor="text1"/>
+          <w:kern w:val="0"/>
+          <w:sz w:val="22"/>
+          <w:szCs w:val="22"/>
+          <w14:ligatures w14:val="none"/>
+        </w:rPr>
+        <w:t>Python Programming Lab</w:t>
+      </w:r>
+      <w:r>
+        <w:rPr>
+          <w:rFonts w:ascii="Times New Roman" w:eastAsia="MS Mincho" w:hAnsi="Times New Roman" w:cs="Times New Roman"/>
+          <w:color w:val="000000" w:themeColor="text1"/>
+          <w:kern w:val="0"/>
+          <w:sz w:val="22"/>
+          <w:szCs w:val="22"/>
+          <w14:ligatures w14:val="none"/>
+        </w:rPr>
+        <w:t xml:space="preserve"> during the academic session </w:t>
+      </w:r>
+      <w:r>
+        <w:rPr>
+          <w:rFonts w:ascii="Times New Roman" w:eastAsia="MS Mincho" w:hAnsi="Times New Roman" w:cs="Times New Roman"/>
+          <w:b/>
+          <w:bCs/>
+          <w:color w:val="000000" w:themeColor="text1"/>
+          <w:kern w:val="0"/>
+          <w:sz w:val="22"/>
+          <w:szCs w:val="22"/>
+          <w14:ligatures w14:val="none"/>
+        </w:rPr>
+        <w:t>2026–2027</w:t>
+      </w:r>
+      <w:r>
+        <w:rPr>
+          <w:rFonts w:ascii="Times New Roman" w:eastAsia="MS Mincho" w:hAnsi="Times New Roman" w:cs="Times New Roman"/>
+          <w:color w:val="000000" w:themeColor="text1"/>
+          <w:kern w:val="0"/>
+          <w:sz w:val="22"/>
+          <w:szCs w:val="22"/>
+          <w14:ligatures w14:val="none"/>
+        </w:rPr>
+        <w:t>.</w:t>
+      </w:r>
+    </w:p>
+    <w:p>
+      <w:pPr>
+        <w:spacing w:after="200" w:line="276" w:lineRule="auto"/>
+        <w:jc w:val="both"/>
+        <w:rPr>
+          <w:rFonts w:ascii="Times New Roman" w:eastAsia="MS Mincho" w:hAnsi="Times New Roman" w:cs="Times New Roman"/>
+          <w:color w:val="000000" w:themeColor="text1"/>
+          <w:kern w:val="0"/>
+          <w:sz w:val="22"/>
+          <w:szCs w:val="22"/>
+          <w14:ligatures w14:val="none"/>
+        </w:rPr>
+      </w:pPr>
+      <w:r>
+        <w:rPr>
+          <w:rFonts w:ascii="Times New Roman" w:eastAsia="MS Mincho" w:hAnsi="Times New Roman" w:cs="Times New Roman"/>
+          <w:color w:val="000000" w:themeColor="text1"/>
+          <w:kern w:val="0"/>
+          <w:sz w:val="22"/>
+          <w:szCs w:val="22"/>
+          <w14:ligatures w14:val="none"/>
+        </w:rPr>
+        <w:t xml:space="preserve">The project demonstrates the practical application of Python programming, SQLite database management, NumPy, Pandas, Matplotlib, and </w:t>
+      </w:r>
+      <w:proofErr w:type="spellStart"/>
+      <w:r>
+        <w:rPr>
+          <w:rFonts w:ascii="Times New Roman" w:eastAsia="MS Mincho" w:hAnsi="Times New Roman" w:cs="Times New Roman"/>
+          <w:color w:val="000000" w:themeColor="text1"/>
+          <w:kern w:val="0"/>
+          <w:sz w:val="22"/>
+          <w:szCs w:val="22"/>
+          <w14:ligatures w14:val="none"/>
+        </w:rPr>
+        <w:t>Tkinter</w:t>
+      </w:r>
+      <w:proofErr w:type="spellEnd"/>
+      <w:r>
+        <w:rPr>
+          <w:rFonts w:ascii="Times New Roman" w:eastAsia="MS Mincho" w:hAnsi="Times New Roman" w:cs="Times New Roman"/>
+          <w:color w:val="000000" w:themeColor="text1"/>
+          <w:kern w:val="0"/>
+          <w:sz w:val="22"/>
+          <w:szCs w:val="22"/>
+          <w14:ligatures w14:val="none"/>
+        </w:rPr>
+        <w:t xml:space="preserve"> in developing a desktop application for personal financial management, expense tracking, budget monitoring, statistical analysis, and data visualization.</w:t>
+      </w:r>
+    </w:p>
+    <w:p>
+      <w:pPr>
+        <w:spacing w:after="200" w:line="276" w:lineRule="auto"/>
+        <w:jc w:val="both"/>
+        <w:rPr>
+          <w:rFonts w:ascii="Times New Roman" w:eastAsia="MS Mincho" w:hAnsi="Times New Roman" w:cs="Times New Roman"/>
+          <w:color w:val="000000" w:themeColor="text1"/>
+          <w:kern w:val="0"/>
+          <w:sz w:val="22"/>
+          <w:szCs w:val="22"/>
+          <w14:ligatures w14:val="none"/>
+        </w:rPr>
+      </w:pPr>
+      <w:r>
+        <w:rPr>
+          <w:rFonts w:ascii="Times New Roman" w:eastAsia="MS Mincho" w:hAnsi="Times New Roman" w:cs="Times New Roman"/>
+          <w:color w:val="000000" w:themeColor="text1"/>
+          <w:kern w:val="0"/>
+          <w:sz w:val="22"/>
+          <w:szCs w:val="22"/>
+          <w14:ligatures w14:val="none"/>
+        </w:rPr>
+        <w:t xml:space="preserve">The project has been completed under faculty guidance and is submitted in partial </w:t>
+      </w:r>
+      <w:proofErr w:type="spellStart"/>
+      <w:r>
+        <w:rPr>
+          <w:rFonts w:ascii="Times New Roman" w:eastAsia="MS Mincho" w:hAnsi="Times New Roman" w:cs="Times New Roman"/>
+          <w:color w:val="000000" w:themeColor="text1"/>
+          <w:kern w:val="0"/>
+          <w:sz w:val="22"/>
+          <w:szCs w:val="22"/>
+          <w14:ligatures w14:val="none"/>
+        </w:rPr>
+        <w:t>fulfillment</w:t>
+      </w:r>
+      <w:proofErr w:type="spellEnd"/>
+      <w:r>
+        <w:rPr>
+          <w:rFonts w:ascii="Times New Roman" w:eastAsia="MS Mincho" w:hAnsi="Times New Roman" w:cs="Times New Roman"/>
+          <w:color w:val="000000" w:themeColor="text1"/>
+          <w:kern w:val="0"/>
+          <w:sz w:val="22"/>
+          <w:szCs w:val="22"/>
+          <w14:ligatures w14:val="none"/>
+        </w:rPr>
+        <w:t xml:space="preserve"> of the academic requirements of the MCA (Data Science) programme.</w:t>
+      </w:r>
+    </w:p>
+    <w:p>
+      <w:pPr>
+        <w:spacing w:after="200" w:line="276" w:lineRule="auto"/>
+        <w:rPr>
+          <w:rFonts w:ascii="Times New Roman" w:eastAsia="MS Mincho" w:hAnsi="Times New Roman" w:cs="Times New Roman"/>
+          <w:color w:val="000000" w:themeColor="text1"/>
+          <w:kern w:val="0"/>
+          <w:sz w:val="22"/>
+          <w:szCs w:val="22"/>
+          <w14:ligatures w14:val="none"/>
+        </w:rPr>
+      </w:pPr>
+      <w:r>
+        <w:rPr>
+          <w:rFonts w:ascii="Times New Roman" w:eastAsia="MS Mincho" w:hAnsi="Times New Roman" w:cs="Times New Roman"/>
+          <w:b/>
+          <w:bCs/>
+          <w:color w:val="000000" w:themeColor="text1"/>
+          <w:kern w:val="0"/>
+          <w:sz w:val="22"/>
+          <w:szCs w:val="22"/>
+          <w14:ligatures w14:val="none"/>
+        </w:rPr>
+        <w:t>Faculty Guide / Project Evaluator:</w:t>
+      </w:r>
+      <w:r>
+        <w:rPr>
+          <w:rFonts w:ascii="Times New Roman" w:eastAsia="MS Mincho" w:hAnsi="Times New Roman" w:cs="Times New Roman"/>
+          <w:color w:val="000000" w:themeColor="text1"/>
+          <w:kern w:val="0"/>
+          <w:sz w:val="22"/>
+          <w:szCs w:val="22"/>
+          <w14:ligatures w14:val="none"/>
+        </w:rPr>
+        <w:t xml:space="preserve"> __________________________</w:t>
+      </w:r>
+    </w:p>
+    <w:p>
+      <w:pPr>
+        <w:spacing w:after="200" w:line="276" w:lineRule="auto"/>
+        <w:rPr>
+          <w:rFonts w:ascii="Times New Roman" w:eastAsia="MS Mincho" w:hAnsi="Times New Roman" w:cs="Times New Roman"/>
+          <w:color w:val="000000" w:themeColor="text1"/>
+          <w:kern w:val="0"/>
+          <w:sz w:val="22"/>
+          <w:szCs w:val="22"/>
+          <w14:ligatures w14:val="none"/>
+        </w:rPr>
+      </w:pPr>
+      <w:r>
+        <w:rPr>
+          <w:rFonts w:ascii="Times New Roman" w:eastAsia="MS Mincho" w:hAnsi="Times New Roman" w:cs="Times New Roman"/>
+          <w:b/>
+          <w:bCs/>
+          <w:color w:val="000000" w:themeColor="text1"/>
+          <w:kern w:val="0"/>
+          <w:sz w:val="22"/>
+          <w:szCs w:val="22"/>
+          <w14:ligatures w14:val="none"/>
+        </w:rPr>
+        <w:t>Student Signature:</w:t>
+      </w:r>
+      <w:r>
+        <w:rPr>
+          <w:rFonts w:ascii="Times New Roman" w:eastAsia="MS Mincho" w:hAnsi="Times New Roman" w:cs="Times New Roman"/>
+          <w:color w:val="000000" w:themeColor="text1"/>
+          <w:kern w:val="0"/>
+          <w:sz w:val="22"/>
+          <w:szCs w:val="22"/>
+          <w14:ligatures w14:val="none"/>
+        </w:rPr>
+        <w:t xml:space="preserve"> __________________________</w:t>
+      </w:r>
+    </w:p>
+    <w:p>
+      <w:pPr>
+        <w:spacing w:after="200" w:line="276" w:lineRule="auto"/>
+        <w:rPr>
+          <w:rFonts w:ascii="Times New Roman" w:eastAsia="MS Mincho" w:hAnsi="Times New Roman" w:cs="Times New Roman"/>
+          <w:color w:val="000000" w:themeColor="text1"/>
+          <w:kern w:val="0"/>
+          <w:sz w:val="22"/>
+          <w:szCs w:val="22"/>
+          <w14:ligatures w14:val="none"/>
+        </w:rPr>
+      </w:pPr>
+      <w:r>
+        <w:rPr>
+          <w:rFonts w:ascii="Times New Roman" w:eastAsia="MS Mincho" w:hAnsi="Times New Roman" w:cs="Times New Roman"/>
+          <w:b/>
+          <w:bCs/>
+          <w:color w:val="000000" w:themeColor="text1"/>
+          <w:kern w:val="0"/>
+          <w:sz w:val="22"/>
+          <w:szCs w:val="22"/>
+          <w14:ligatures w14:val="none"/>
+        </w:rPr>
+        <w:t>Date:</w:t>
+      </w:r>
+      <w:r>
+        <w:rPr>
+          <w:rFonts w:ascii="Times New Roman" w:eastAsia="MS Mincho" w:hAnsi="Times New Roman" w:cs="Times New Roman"/>
+          <w:color w:val="000000" w:themeColor="text1"/>
+          <w:kern w:val="0"/>
+          <w:sz w:val="22"/>
+          <w:szCs w:val="22"/>
+          <w14:ligatures w14:val="none"/>
+        </w:rPr>
+        <w:t xml:space="preserve"> __________________________</w:t>
+      </w:r>
+    </w:p>
+    <w:p>
+      <w:pPr>
+        <w:spacing w:after="200" w:line="276" w:lineRule="auto"/>
+        <w:rPr>
+          <w:rFonts w:ascii="Times New Roman" w:eastAsia="MS Mincho" w:hAnsi="Times New Roman" w:cs="Times New Roman"/>
+          <w:b/>
+          <w:color w:val="000000" w:themeColor="text1"/>
+          <w:kern w:val="0"/>
+          <w:sz w:val="32"/>
+          <w:szCs w:val="22"/>
+          <w:lang w:val="en-US"/>
+          <w14:ligatures w14:val="none"/>
+        </w:rPr>
+      </w:pPr>
+    </w:p>
+    <w:p>
+      <w:pPr>
+        <w:spacing w:after="200" w:line="276" w:lineRule="auto"/>
+        <w:rPr>
+          <w:rFonts w:ascii="Times New Roman" w:eastAsia="MS Mincho" w:hAnsi="Times New Roman" w:cs="Times New Roman"/>
+          <w:b/>
+          <w:color w:val="000000" w:themeColor="text1"/>
+          <w:kern w:val="0"/>
+          <w:sz w:val="32"/>
+          <w:szCs w:val="22"/>
+          <w:lang w:val="en-US"/>
+          <w14:ligatures w14:val="none"/>
+        </w:rPr>
+      </w:pPr>
     </w:p>
     <w:p>
       <w:pPr>
@@ -3290,6 +3722,17 @@
         <w:jc w:val="center"/>
         <w:rPr>
           <w:rFonts w:ascii="Times New Roman" w:eastAsia="MS Mincho" w:hAnsi="Times New Roman" w:cs="Times New Roman"/>
+          <w:color w:val="000000" w:themeColor="text1"/>
+          <w:kern w:val="0"/>
+          <w:sz w:val="22"/>
+          <w:szCs w:val="22"/>
+          <w:lang w:val="en-US"/>
+          <w14:ligatures w14:val="none"/>
+        </w:rPr>
+      </w:pPr>
+      <w:r>
+        <w:rPr>
+          <w:rFonts w:ascii="Times New Roman" w:eastAsia="MS Mincho" w:hAnsi="Times New Roman" w:cs="Times New Roman"/>
           <w:b/>
           <w:color w:val="000000" w:themeColor="text1"/>
           <w:kern w:val="0"/>
@@ -3298,11 +3741,308 @@
           <w:lang w:val="en-US"/>
           <w14:ligatures w14:val="none"/>
         </w:rPr>
-      </w:pPr>
+        <w:t>DECLARATION</w:t>
+      </w:r>
+    </w:p>
+    <w:p>
+      <w:pPr>
+        <w:spacing w:after="100" w:line="276" w:lineRule="auto"/>
+        <w:jc w:val="both"/>
+        <w:rPr>
+          <w:rFonts w:ascii="Times New Roman" w:eastAsia="MS Mincho" w:hAnsi="Times New Roman" w:cs="Times New Roman"/>
+          <w:color w:val="000000" w:themeColor="text1"/>
+          <w:kern w:val="0"/>
+          <w:sz w:val="22"/>
+          <w:szCs w:val="22"/>
+          <w14:ligatures w14:val="none"/>
+        </w:rPr>
+      </w:pPr>
+      <w:r>
+        <w:rPr>
+          <w:rFonts w:ascii="Times New Roman" w:eastAsia="MS Mincho" w:hAnsi="Times New Roman" w:cs="Times New Roman"/>
+          <w:color w:val="000000" w:themeColor="text1"/>
+          <w:kern w:val="0"/>
+          <w:sz w:val="22"/>
+          <w:szCs w:val="22"/>
+          <w14:ligatures w14:val="none"/>
+        </w:rPr>
+        <w:t xml:space="preserve">I, </w:t>
+      </w:r>
       <w:r>
         <w:rPr>
           <w:rFonts w:ascii="Times New Roman" w:eastAsia="MS Mincho" w:hAnsi="Times New Roman" w:cs="Times New Roman"/>
           <w:b/>
+          <w:bCs/>
+          <w:color w:val="000000" w:themeColor="text1"/>
+          <w:kern w:val="0"/>
+          <w:sz w:val="22"/>
+          <w:szCs w:val="22"/>
+          <w14:ligatures w14:val="none"/>
+        </w:rPr>
+        <w:t>Arpit Saxena</w:t>
+      </w:r>
+      <w:r>
+        <w:rPr>
+          <w:rFonts w:ascii="Times New Roman" w:eastAsia="MS Mincho" w:hAnsi="Times New Roman" w:cs="Times New Roman"/>
+          <w:color w:val="000000" w:themeColor="text1"/>
+          <w:kern w:val="0"/>
+          <w:sz w:val="22"/>
+          <w:szCs w:val="22"/>
+          <w14:ligatures w14:val="none"/>
+        </w:rPr>
+        <w:t xml:space="preserve">, hereby declare that the mini-project entitled </w:t>
+      </w:r>
+      <w:r>
+        <w:rPr>
+          <w:rFonts w:ascii="Times New Roman" w:eastAsia="MS Mincho" w:hAnsi="Times New Roman" w:cs="Times New Roman"/>
+          <w:b/>
+          <w:bCs/>
+          <w:color w:val="000000" w:themeColor="text1"/>
+          <w:kern w:val="0"/>
+          <w:sz w:val="22"/>
+          <w:szCs w:val="22"/>
+          <w14:ligatures w14:val="none"/>
+        </w:rPr>
+        <w:t>“Personal Finance and Expense Analytics System”</w:t>
+      </w:r>
+      <w:r>
+        <w:rPr>
+          <w:rFonts w:ascii="Times New Roman" w:eastAsia="MS Mincho" w:hAnsi="Times New Roman" w:cs="Times New Roman"/>
+          <w:color w:val="000000" w:themeColor="text1"/>
+          <w:kern w:val="0"/>
+          <w:sz w:val="22"/>
+          <w:szCs w:val="22"/>
+          <w14:ligatures w14:val="none"/>
+        </w:rPr>
+        <w:t xml:space="preserve"> is my original academic work, carried out as part of the </w:t>
+      </w:r>
+      <w:r>
+        <w:rPr>
+          <w:rFonts w:ascii="Times New Roman" w:eastAsia="MS Mincho" w:hAnsi="Times New Roman" w:cs="Times New Roman"/>
+          <w:b/>
+          <w:bCs/>
+          <w:color w:val="000000" w:themeColor="text1"/>
+          <w:kern w:val="0"/>
+          <w:sz w:val="22"/>
+          <w:szCs w:val="22"/>
+          <w14:ligatures w14:val="none"/>
+        </w:rPr>
+        <w:t>Master of Computer Applications (MCA) – Data Science, 1st Semester</w:t>
+      </w:r>
+      <w:r>
+        <w:rPr>
+          <w:rFonts w:ascii="Times New Roman" w:eastAsia="MS Mincho" w:hAnsi="Times New Roman" w:cs="Times New Roman"/>
+          <w:color w:val="000000" w:themeColor="text1"/>
+          <w:kern w:val="0"/>
+          <w:sz w:val="22"/>
+          <w:szCs w:val="22"/>
+          <w14:ligatures w14:val="none"/>
+        </w:rPr>
+        <w:t xml:space="preserve"> programme at Chandigarh University, Mohali.</w:t>
+      </w:r>
+    </w:p>
+    <w:p>
+      <w:pPr>
+        <w:spacing w:after="100" w:line="276" w:lineRule="auto"/>
+        <w:jc w:val="both"/>
+        <w:rPr>
+          <w:rFonts w:ascii="Times New Roman" w:eastAsia="MS Mincho" w:hAnsi="Times New Roman" w:cs="Times New Roman"/>
+          <w:color w:val="000000" w:themeColor="text1"/>
+          <w:kern w:val="0"/>
+          <w:sz w:val="22"/>
+          <w:szCs w:val="22"/>
+          <w14:ligatures w14:val="none"/>
+        </w:rPr>
+      </w:pPr>
+      <w:r>
+        <w:rPr>
+          <w:rFonts w:ascii="Times New Roman" w:eastAsia="MS Mincho" w:hAnsi="Times New Roman" w:cs="Times New Roman"/>
+          <w:color w:val="000000" w:themeColor="text1"/>
+          <w:kern w:val="0"/>
+          <w:sz w:val="22"/>
+          <w:szCs w:val="22"/>
+          <w14:ligatures w14:val="none"/>
+        </w:rPr>
+        <w:t xml:space="preserve">The project has been developed as part of the </w:t>
+      </w:r>
+      <w:r>
+        <w:rPr>
+          <w:rFonts w:ascii="Times New Roman" w:eastAsia="MS Mincho" w:hAnsi="Times New Roman" w:cs="Times New Roman"/>
+          <w:b/>
+          <w:bCs/>
+          <w:color w:val="000000" w:themeColor="text1"/>
+          <w:kern w:val="0"/>
+          <w:sz w:val="22"/>
+          <w:szCs w:val="22"/>
+          <w14:ligatures w14:val="none"/>
+        </w:rPr>
+        <w:t>Python Programming Lab</w:t>
+      </w:r>
+      <w:r>
+        <w:rPr>
+          <w:rFonts w:ascii="Times New Roman" w:eastAsia="MS Mincho" w:hAnsi="Times New Roman" w:cs="Times New Roman"/>
+          <w:color w:val="000000" w:themeColor="text1"/>
+          <w:kern w:val="0"/>
+          <w:sz w:val="22"/>
+          <w:szCs w:val="22"/>
+          <w14:ligatures w14:val="none"/>
+        </w:rPr>
+        <w:t xml:space="preserve"> during the academic session </w:t>
+      </w:r>
+      <w:r>
+        <w:rPr>
+          <w:rFonts w:ascii="Times New Roman" w:eastAsia="MS Mincho" w:hAnsi="Times New Roman" w:cs="Times New Roman"/>
+          <w:b/>
+          <w:bCs/>
+          <w:color w:val="000000" w:themeColor="text1"/>
+          <w:kern w:val="0"/>
+          <w:sz w:val="22"/>
+          <w:szCs w:val="22"/>
+          <w14:ligatures w14:val="none"/>
+        </w:rPr>
+        <w:t>2026–2027</w:t>
+      </w:r>
+      <w:r>
+        <w:rPr>
+          <w:rFonts w:ascii="Times New Roman" w:eastAsia="MS Mincho" w:hAnsi="Times New Roman" w:cs="Times New Roman"/>
+          <w:color w:val="000000" w:themeColor="text1"/>
+          <w:kern w:val="0"/>
+          <w:sz w:val="22"/>
+          <w:szCs w:val="22"/>
+          <w14:ligatures w14:val="none"/>
+        </w:rPr>
+        <w:t>. The work presented in this report reflects my understanding and practical application of Python programming, database management, data analytics, and data visualization.</w:t>
+      </w:r>
+    </w:p>
+    <w:p>
+      <w:pPr>
+        <w:spacing w:after="100" w:line="276" w:lineRule="auto"/>
+        <w:jc w:val="both"/>
+        <w:rPr>
+          <w:rFonts w:ascii="Times New Roman" w:eastAsia="MS Mincho" w:hAnsi="Times New Roman" w:cs="Times New Roman"/>
+          <w:color w:val="000000" w:themeColor="text1"/>
+          <w:kern w:val="0"/>
+          <w:sz w:val="22"/>
+          <w:szCs w:val="22"/>
+          <w14:ligatures w14:val="none"/>
+        </w:rPr>
+      </w:pPr>
+      <w:r>
+        <w:rPr>
+          <w:rFonts w:ascii="Times New Roman" w:eastAsia="MS Mincho" w:hAnsi="Times New Roman" w:cs="Times New Roman"/>
+          <w:color w:val="000000" w:themeColor="text1"/>
+          <w:kern w:val="0"/>
+          <w:sz w:val="22"/>
+          <w:szCs w:val="22"/>
+          <w14:ligatures w14:val="none"/>
+        </w:rPr>
+        <w:t xml:space="preserve">I hereby declare that this project report has been prepared for academic purposes and that the work presented is submitted in partial </w:t>
+      </w:r>
+      <w:proofErr w:type="spellStart"/>
+      <w:r>
+        <w:rPr>
+          <w:rFonts w:ascii="Times New Roman" w:eastAsia="MS Mincho" w:hAnsi="Times New Roman" w:cs="Times New Roman"/>
+          <w:color w:val="000000" w:themeColor="text1"/>
+          <w:kern w:val="0"/>
+          <w:sz w:val="22"/>
+          <w:szCs w:val="22"/>
+          <w14:ligatures w14:val="none"/>
+        </w:rPr>
+        <w:t>fulfillment</w:t>
+      </w:r>
+      <w:proofErr w:type="spellEnd"/>
+      <w:r>
+        <w:rPr>
+          <w:rFonts w:ascii="Times New Roman" w:eastAsia="MS Mincho" w:hAnsi="Times New Roman" w:cs="Times New Roman"/>
+          <w:color w:val="000000" w:themeColor="text1"/>
+          <w:kern w:val="0"/>
+          <w:sz w:val="22"/>
+          <w:szCs w:val="22"/>
+          <w14:ligatures w14:val="none"/>
+        </w:rPr>
+        <w:t xml:space="preserve"> of the academic requirements of the MCA (Data Science) programme.</w:t>
+      </w:r>
+    </w:p>
+    <w:p>
+      <w:pPr>
+        <w:spacing w:after="100" w:line="276" w:lineRule="auto"/>
+        <w:rPr>
+          <w:rFonts w:ascii="Times New Roman" w:eastAsia="MS Mincho" w:hAnsi="Times New Roman" w:cs="Times New Roman"/>
+          <w:color w:val="000000" w:themeColor="text1"/>
+          <w:kern w:val="0"/>
+          <w:sz w:val="22"/>
+          <w:szCs w:val="22"/>
+          <w14:ligatures w14:val="none"/>
+        </w:rPr>
+      </w:pPr>
+      <w:r>
+        <w:rPr>
+          <w:rFonts w:ascii="Times New Roman" w:eastAsia="MS Mincho" w:hAnsi="Times New Roman" w:cs="Times New Roman"/>
+          <w:b/>
+          <w:bCs/>
+          <w:color w:val="000000" w:themeColor="text1"/>
+          <w:kern w:val="0"/>
+          <w:sz w:val="22"/>
+          <w:szCs w:val="22"/>
+          <w14:ligatures w14:val="none"/>
+        </w:rPr>
+        <w:t>Student Signature:</w:t>
+      </w:r>
+      <w:r>
+        <w:rPr>
+          <w:rFonts w:ascii="Times New Roman" w:eastAsia="MS Mincho" w:hAnsi="Times New Roman" w:cs="Times New Roman"/>
+          <w:color w:val="000000" w:themeColor="text1"/>
+          <w:kern w:val="0"/>
+          <w:sz w:val="22"/>
+          <w:szCs w:val="22"/>
+          <w14:ligatures w14:val="none"/>
+        </w:rPr>
+        <w:t xml:space="preserve"> __________________________</w:t>
+      </w:r>
+    </w:p>
+    <w:p>
+      <w:pPr>
+        <w:spacing w:after="100" w:line="276" w:lineRule="auto"/>
+        <w:rPr>
+          <w:rFonts w:ascii="Times New Roman" w:eastAsia="MS Mincho" w:hAnsi="Times New Roman" w:cs="Times New Roman"/>
+          <w:color w:val="000000" w:themeColor="text1"/>
+          <w:kern w:val="0"/>
+          <w:sz w:val="22"/>
+          <w:szCs w:val="22"/>
+          <w14:ligatures w14:val="none"/>
+        </w:rPr>
+      </w:pPr>
+      <w:r>
+        <w:rPr>
+          <w:rFonts w:ascii="Times New Roman" w:eastAsia="MS Mincho" w:hAnsi="Times New Roman" w:cs="Times New Roman"/>
+          <w:b/>
+          <w:bCs/>
+          <w:color w:val="000000" w:themeColor="text1"/>
+          <w:kern w:val="0"/>
+          <w:sz w:val="22"/>
+          <w:szCs w:val="22"/>
+          <w14:ligatures w14:val="none"/>
+        </w:rPr>
+        <w:t>Date:</w:t>
+      </w:r>
+      <w:r>
+        <w:rPr>
+          <w:rFonts w:ascii="Times New Roman" w:eastAsia="MS Mincho" w:hAnsi="Times New Roman" w:cs="Times New Roman"/>
+          <w:color w:val="000000" w:themeColor="text1"/>
+          <w:kern w:val="0"/>
+          <w:sz w:val="22"/>
+          <w:szCs w:val="22"/>
+          <w14:ligatures w14:val="none"/>
+        </w:rPr>
+        <w:t xml:space="preserve"> __________________________</w:t>
+      </w:r>
+    </w:p>
+    <w:p>
+      <w:pPr>
+        <w:spacing w:after="100" w:line="276" w:lineRule="auto"/>
+        <w:rPr>
+          <w:rFonts w:ascii="Times New Roman" w:eastAsia="MS Mincho" w:hAnsi="Times New Roman" w:cs="Times New Roman"/>
+          <w:b/>
           <w:color w:val="000000" w:themeColor="text1"/>
           <w:kern w:val="0"/>
           <w:sz w:val="32"/>
@@ -3310,8 +4050,67 @@
           <w:lang w:val="en-US"/>
           <w14:ligatures w14:val="none"/>
         </w:rPr>
+      </w:pPr>
+    </w:p>
+    <w:p>
+      <w:pPr>
+        <w:spacing w:after="200" w:line="276" w:lineRule="auto"/>
+        <w:jc w:val="center"/>
+        <w:rPr>
+          <w:rFonts w:ascii="Times New Roman" w:eastAsia="MS Mincho" w:hAnsi="Times New Roman" w:cs="Times New Roman"/>
+          <w:b/>
+          <w:color w:val="000000" w:themeColor="text1"/>
+          <w:kern w:val="0"/>
+          <w:sz w:val="32"/>
+          <w:szCs w:val="22"/>
+          <w:lang w:val="en-US"/>
+          <w14:ligatures w14:val="none"/>
+        </w:rPr>
+      </w:pPr>
+    </w:p>
+    <w:p>
+      <w:pPr>
+        <w:spacing w:after="200" w:line="276" w:lineRule="auto"/>
+        <w:jc w:val="center"/>
+        <w:rPr>
+          <w:rFonts w:ascii="Times New Roman" w:eastAsia="MS Mincho" w:hAnsi="Times New Roman" w:cs="Times New Roman"/>
+          <w:b/>
+          <w:color w:val="000000" w:themeColor="text1"/>
+          <w:kern w:val="0"/>
+          <w:sz w:val="32"/>
+          <w:szCs w:val="22"/>
+          <w:lang w:val="en-US"/>
+          <w14:ligatures w14:val="none"/>
+        </w:rPr>
+      </w:pPr>
+    </w:p>
+    <w:p>
+      <w:pPr>
+        <w:spacing w:after="200" w:line="276" w:lineRule="auto"/>
+        <w:jc w:val="center"/>
+        <w:rPr>
+          <w:rFonts w:ascii="Times New Roman" w:eastAsia="MS Mincho" w:hAnsi="Times New Roman" w:cs="Times New Roman"/>
+          <w:color w:val="000000" w:themeColor="text1"/>
+          <w:kern w:val="0"/>
+          <w:sz w:val="22"/>
+          <w:szCs w:val="22"/>
+          <w:lang w:val="en-US"/>
+          <w14:ligatures w14:val="none"/>
+        </w:rPr>
+      </w:pPr>
+      <w:r>
+        <w:rPr>
+          <w:rFonts w:ascii="Times New Roman" w:eastAsia="MS Mincho" w:hAnsi="Times New Roman" w:cs="Times New Roman"/>
+          <w:b/>
+          <w:color w:val="000000" w:themeColor="text1"/>
+          <w:kern w:val="0"/>
+          <w:sz w:val="32"/>
+          <w:szCs w:val="22"/>
+          <w:lang w:val="en-US"/>
+          <w14:ligatures w14:val="none"/>
+        </w:rPr>
         <w:lastRenderedPageBreak/>
-        <w:t>CERTIFICATE</w:t>
+        <w:t>ACKNOWLEDGEMENT</w:t>
       </w:r>
     </w:p>
     <w:p>
@@ -3336,7 +4135,7 @@
           <w:szCs w:val="22"/>
           <w14:ligatures w14:val="none"/>
         </w:rPr>
-        <w:t xml:space="preserve">This is to certify that </w:t>
+        <w:t xml:space="preserve">I would like to express my sincere gratitude to </w:t>
       </w:r>
       <w:r>
         <w:rPr>
@@ -3349,814 +4148,7 @@
           <w:szCs w:val="22"/>
           <w14:ligatures w14:val="none"/>
         </w:rPr>
-        <w:t>Arpit Saxena</w:t>
-      </w:r>
-      <w:r>
-        <w:rPr>
-          <w:rFonts w:ascii="Times New Roman" w:eastAsia="MS Mincho" w:hAnsi="Times New Roman" w:cs="Times New Roman"/>
-          <w:color w:val="000000" w:themeColor="text1"/>
-          <w:kern w:val="0"/>
-          <w:sz w:val="22"/>
-          <w:szCs w:val="22"/>
-          <w14:ligatures w14:val="none"/>
-        </w:rPr>
-        <w:t xml:space="preserve">, a student of </w:t>
-      </w:r>
-      <w:r>
-        <w:rPr>
-          <w:rFonts w:ascii="Times New Roman" w:eastAsia="MS Mincho" w:hAnsi="Times New Roman" w:cs="Times New Roman"/>
-          <w:b/>
-          <w:bCs/>
-          <w:color w:val="000000" w:themeColor="text1"/>
-          <w:kern w:val="0"/>
-          <w:sz w:val="22"/>
-          <w:szCs w:val="22"/>
-          <w14:ligatures w14:val="none"/>
-        </w:rPr>
-        <w:t>Master of Computer Applications (MCA) – Data Science, 1st Semester</w:t>
-      </w:r>
-      <w:r>
-        <w:rPr>
-          <w:rFonts w:ascii="Times New Roman" w:eastAsia="MS Mincho" w:hAnsi="Times New Roman" w:cs="Times New Roman"/>
-          <w:color w:val="000000" w:themeColor="text1"/>
-          <w:kern w:val="0"/>
-          <w:sz w:val="22"/>
-          <w:szCs w:val="22"/>
-          <w14:ligatures w14:val="none"/>
-        </w:rPr>
-        <w:t xml:space="preserve">, at Chandigarh University, Mohali, has successfully completed the mini-project entitled </w:t>
-      </w:r>
-      <w:r>
-        <w:rPr>
-          <w:rFonts w:ascii="Times New Roman" w:eastAsia="MS Mincho" w:hAnsi="Times New Roman" w:cs="Times New Roman"/>
-          <w:b/>
-          <w:bCs/>
-          <w:color w:val="000000" w:themeColor="text1"/>
-          <w:kern w:val="0"/>
-          <w:sz w:val="22"/>
-          <w:szCs w:val="22"/>
-          <w14:ligatures w14:val="none"/>
-        </w:rPr>
-        <w:t>“Personal Finance and Expense Analytics System”</w:t>
-      </w:r>
-      <w:r>
-        <w:rPr>
-          <w:rFonts w:ascii="Times New Roman" w:eastAsia="MS Mincho" w:hAnsi="Times New Roman" w:cs="Times New Roman"/>
-          <w:color w:val="000000" w:themeColor="text1"/>
-          <w:kern w:val="0"/>
-          <w:sz w:val="22"/>
-          <w:szCs w:val="22"/>
-          <w14:ligatures w14:val="none"/>
-        </w:rPr>
-        <w:t xml:space="preserve"> as part of the academic requirements for the </w:t>
-      </w:r>
-      <w:r>
-        <w:rPr>
-          <w:rFonts w:ascii="Times New Roman" w:eastAsia="MS Mincho" w:hAnsi="Times New Roman" w:cs="Times New Roman"/>
-          <w:b/>
-          <w:bCs/>
-          <w:color w:val="000000" w:themeColor="text1"/>
-          <w:kern w:val="0"/>
-          <w:sz w:val="22"/>
-          <w:szCs w:val="22"/>
-          <w14:ligatures w14:val="none"/>
-        </w:rPr>
-        <w:t>Python Programming Lab</w:t>
-      </w:r>
-      <w:r>
-        <w:rPr>
-          <w:rFonts w:ascii="Times New Roman" w:eastAsia="MS Mincho" w:hAnsi="Times New Roman" w:cs="Times New Roman"/>
-          <w:color w:val="000000" w:themeColor="text1"/>
-          <w:kern w:val="0"/>
-          <w:sz w:val="22"/>
-          <w:szCs w:val="22"/>
-          <w14:ligatures w14:val="none"/>
-        </w:rPr>
-        <w:t xml:space="preserve"> during the academic session </w:t>
-      </w:r>
-      <w:r>
-        <w:rPr>
-          <w:rFonts w:ascii="Times New Roman" w:eastAsia="MS Mincho" w:hAnsi="Times New Roman" w:cs="Times New Roman"/>
-          <w:b/>
-          <w:bCs/>
-          <w:color w:val="000000" w:themeColor="text1"/>
-          <w:kern w:val="0"/>
-          <w:sz w:val="22"/>
-          <w:szCs w:val="22"/>
-          <w14:ligatures w14:val="none"/>
-        </w:rPr>
-        <w:t>2026–2027</w:t>
-      </w:r>
-      <w:r>
-        <w:rPr>
-          <w:rFonts w:ascii="Times New Roman" w:eastAsia="MS Mincho" w:hAnsi="Times New Roman" w:cs="Times New Roman"/>
-          <w:color w:val="000000" w:themeColor="text1"/>
-          <w:kern w:val="0"/>
-          <w:sz w:val="22"/>
-          <w:szCs w:val="22"/>
-          <w14:ligatures w14:val="none"/>
-        </w:rPr>
-        <w:t>.</w:t>
-      </w:r>
-    </w:p>
-    <w:p>
-      <w:pPr>
-        <w:spacing w:after="200" w:line="276" w:lineRule="auto"/>
-        <w:jc w:val="both"/>
-        <w:rPr>
-          <w:rFonts w:ascii="Times New Roman" w:eastAsia="MS Mincho" w:hAnsi="Times New Roman" w:cs="Times New Roman"/>
-          <w:color w:val="000000" w:themeColor="text1"/>
-          <w:kern w:val="0"/>
-          <w:sz w:val="22"/>
-          <w:szCs w:val="22"/>
-          <w14:ligatures w14:val="none"/>
-        </w:rPr>
-      </w:pPr>
-      <w:r>
-        <w:rPr>
-          <w:rFonts w:ascii="Times New Roman" w:eastAsia="MS Mincho" w:hAnsi="Times New Roman" w:cs="Times New Roman"/>
-          <w:color w:val="000000" w:themeColor="text1"/>
-          <w:kern w:val="0"/>
-          <w:sz w:val="22"/>
-          <w:szCs w:val="22"/>
-          <w14:ligatures w14:val="none"/>
-        </w:rPr>
-        <w:t xml:space="preserve">The project demonstrates the practical application of Python programming, SQLite database management, NumPy, Pandas, Matplotlib, and </w:t>
-      </w:r>
-      <w:proofErr w:type="spellStart"/>
-      <w:r>
-        <w:rPr>
-          <w:rFonts w:ascii="Times New Roman" w:eastAsia="MS Mincho" w:hAnsi="Times New Roman" w:cs="Times New Roman"/>
-          <w:color w:val="000000" w:themeColor="text1"/>
-          <w:kern w:val="0"/>
-          <w:sz w:val="22"/>
-          <w:szCs w:val="22"/>
-          <w14:ligatures w14:val="none"/>
-        </w:rPr>
-        <w:t>Tkinter</w:t>
-      </w:r>
-      <w:proofErr w:type="spellEnd"/>
-      <w:r>
-        <w:rPr>
-          <w:rFonts w:ascii="Times New Roman" w:eastAsia="MS Mincho" w:hAnsi="Times New Roman" w:cs="Times New Roman"/>
-          <w:color w:val="000000" w:themeColor="text1"/>
-          <w:kern w:val="0"/>
-          <w:sz w:val="22"/>
-          <w:szCs w:val="22"/>
-          <w14:ligatures w14:val="none"/>
-        </w:rPr>
-        <w:t xml:space="preserve"> in developing a desktop application for personal financial management, expense tracking, budget monitoring, statistical analysis, and data visualization.</w:t>
-      </w:r>
-    </w:p>
-    <w:p>
-      <w:pPr>
-        <w:spacing w:after="200" w:line="276" w:lineRule="auto"/>
-        <w:jc w:val="both"/>
-        <w:rPr>
-          <w:rFonts w:ascii="Times New Roman" w:eastAsia="MS Mincho" w:hAnsi="Times New Roman" w:cs="Times New Roman"/>
-          <w:color w:val="000000" w:themeColor="text1"/>
-          <w:kern w:val="0"/>
-          <w:sz w:val="22"/>
-          <w:szCs w:val="22"/>
-          <w14:ligatures w14:val="none"/>
-        </w:rPr>
-      </w:pPr>
-      <w:r>
-        <w:rPr>
-          <w:rFonts w:ascii="Times New Roman" w:eastAsia="MS Mincho" w:hAnsi="Times New Roman" w:cs="Times New Roman"/>
-          <w:color w:val="000000" w:themeColor="text1"/>
-          <w:kern w:val="0"/>
-          <w:sz w:val="22"/>
-          <w:szCs w:val="22"/>
-          <w14:ligatures w14:val="none"/>
-        </w:rPr>
-        <w:t xml:space="preserve">The project has been completed under faculty guidance and is submitted in partial </w:t>
-      </w:r>
-      <w:proofErr w:type="spellStart"/>
-      <w:r>
-        <w:rPr>
-          <w:rFonts w:ascii="Times New Roman" w:eastAsia="MS Mincho" w:hAnsi="Times New Roman" w:cs="Times New Roman"/>
-          <w:color w:val="000000" w:themeColor="text1"/>
-          <w:kern w:val="0"/>
-          <w:sz w:val="22"/>
-          <w:szCs w:val="22"/>
-          <w14:ligatures w14:val="none"/>
-        </w:rPr>
-        <w:t>fulfillment</w:t>
-      </w:r>
-      <w:proofErr w:type="spellEnd"/>
-      <w:r>
-        <w:rPr>
-          <w:rFonts w:ascii="Times New Roman" w:eastAsia="MS Mincho" w:hAnsi="Times New Roman" w:cs="Times New Roman"/>
-          <w:color w:val="000000" w:themeColor="text1"/>
-          <w:kern w:val="0"/>
-          <w:sz w:val="22"/>
-          <w:szCs w:val="22"/>
-          <w14:ligatures w14:val="none"/>
-        </w:rPr>
-        <w:t xml:space="preserve"> of the academic requirements of the MCA (Data Science) programme.</w:t>
-      </w:r>
-    </w:p>
-    <w:p>
-      <w:pPr>
-        <w:spacing w:after="200" w:line="276" w:lineRule="auto"/>
-        <w:rPr>
-          <w:rFonts w:ascii="Times New Roman" w:eastAsia="MS Mincho" w:hAnsi="Times New Roman" w:cs="Times New Roman"/>
-          <w:color w:val="000000" w:themeColor="text1"/>
-          <w:kern w:val="0"/>
-          <w:sz w:val="22"/>
-          <w:szCs w:val="22"/>
-          <w14:ligatures w14:val="none"/>
-        </w:rPr>
-      </w:pPr>
-      <w:r>
-        <w:rPr>
-          <w:rFonts w:ascii="Times New Roman" w:eastAsia="MS Mincho" w:hAnsi="Times New Roman" w:cs="Times New Roman"/>
-          <w:b/>
-          <w:bCs/>
-          <w:color w:val="000000" w:themeColor="text1"/>
-          <w:kern w:val="0"/>
-          <w:sz w:val="22"/>
-          <w:szCs w:val="22"/>
-          <w14:ligatures w14:val="none"/>
-        </w:rPr>
-        <w:t>Faculty Guide / Project Evaluator:</w:t>
-      </w:r>
-      <w:r>
-        <w:rPr>
-          <w:rFonts w:ascii="Times New Roman" w:eastAsia="MS Mincho" w:hAnsi="Times New Roman" w:cs="Times New Roman"/>
-          <w:color w:val="000000" w:themeColor="text1"/>
-          <w:kern w:val="0"/>
-          <w:sz w:val="22"/>
-          <w:szCs w:val="22"/>
-          <w14:ligatures w14:val="none"/>
-        </w:rPr>
-        <w:t xml:space="preserve"> __________________________</w:t>
-      </w:r>
-    </w:p>
-    <w:p>
-      <w:pPr>
-        <w:spacing w:after="200" w:line="276" w:lineRule="auto"/>
-        <w:rPr>
-          <w:rFonts w:ascii="Times New Roman" w:eastAsia="MS Mincho" w:hAnsi="Times New Roman" w:cs="Times New Roman"/>
-          <w:color w:val="000000" w:themeColor="text1"/>
-          <w:kern w:val="0"/>
-          <w:sz w:val="22"/>
-          <w:szCs w:val="22"/>
-          <w14:ligatures w14:val="none"/>
-        </w:rPr>
-      </w:pPr>
-      <w:r>
-        <w:rPr>
-          <w:rFonts w:ascii="Times New Roman" w:eastAsia="MS Mincho" w:hAnsi="Times New Roman" w:cs="Times New Roman"/>
-          <w:b/>
-          <w:bCs/>
-          <w:color w:val="000000" w:themeColor="text1"/>
-          <w:kern w:val="0"/>
-          <w:sz w:val="22"/>
-          <w:szCs w:val="22"/>
-          <w14:ligatures w14:val="none"/>
-        </w:rPr>
-        <w:t>Student Signature:</w:t>
-      </w:r>
-      <w:r>
-        <w:rPr>
-          <w:rFonts w:ascii="Times New Roman" w:eastAsia="MS Mincho" w:hAnsi="Times New Roman" w:cs="Times New Roman"/>
-          <w:color w:val="000000" w:themeColor="text1"/>
-          <w:kern w:val="0"/>
-          <w:sz w:val="22"/>
-          <w:szCs w:val="22"/>
-          <w14:ligatures w14:val="none"/>
-        </w:rPr>
-        <w:t xml:space="preserve"> __________________________</w:t>
-      </w:r>
-    </w:p>
-    <w:p>
-      <w:pPr>
-        <w:spacing w:after="200" w:line="276" w:lineRule="auto"/>
-        <w:rPr>
-          <w:rFonts w:ascii="Times New Roman" w:eastAsia="MS Mincho" w:hAnsi="Times New Roman" w:cs="Times New Roman"/>
-          <w:color w:val="000000" w:themeColor="text1"/>
-          <w:kern w:val="0"/>
-          <w:sz w:val="22"/>
-          <w:szCs w:val="22"/>
-          <w14:ligatures w14:val="none"/>
-        </w:rPr>
-      </w:pPr>
-      <w:r>
-        <w:rPr>
-          <w:rFonts w:ascii="Times New Roman" w:eastAsia="MS Mincho" w:hAnsi="Times New Roman" w:cs="Times New Roman"/>
-          <w:b/>
-          <w:bCs/>
-          <w:color w:val="000000" w:themeColor="text1"/>
-          <w:kern w:val="0"/>
-          <w:sz w:val="22"/>
-          <w:szCs w:val="22"/>
-          <w14:ligatures w14:val="none"/>
-        </w:rPr>
-        <w:t>Date:</w:t>
-      </w:r>
-      <w:r>
-        <w:rPr>
-          <w:rFonts w:ascii="Times New Roman" w:eastAsia="MS Mincho" w:hAnsi="Times New Roman" w:cs="Times New Roman"/>
-          <w:color w:val="000000" w:themeColor="text1"/>
-          <w:kern w:val="0"/>
-          <w:sz w:val="22"/>
-          <w:szCs w:val="22"/>
-          <w14:ligatures w14:val="none"/>
-        </w:rPr>
-        <w:t xml:space="preserve"> __________________________</w:t>
-      </w:r>
-    </w:p>
-    <w:p>
-      <w:pPr>
-        <w:spacing w:after="200" w:line="276" w:lineRule="auto"/>
-        <w:rPr>
-          <w:rFonts w:ascii="Times New Roman" w:eastAsia="MS Mincho" w:hAnsi="Times New Roman" w:cs="Times New Roman"/>
-          <w:b/>
-          <w:color w:val="000000" w:themeColor="text1"/>
-          <w:kern w:val="0"/>
-          <w:sz w:val="32"/>
-          <w:szCs w:val="22"/>
-          <w:lang w:val="en-US"/>
-          <w14:ligatures w14:val="none"/>
-        </w:rPr>
-      </w:pPr>
-    </w:p>
-    <w:p>
-      <w:pPr>
-        <w:spacing w:after="200" w:line="276" w:lineRule="auto"/>
-        <w:rPr>
-          <w:rFonts w:ascii="Times New Roman" w:eastAsia="MS Mincho" w:hAnsi="Times New Roman" w:cs="Times New Roman"/>
-          <w:b/>
-          <w:color w:val="000000" w:themeColor="text1"/>
-          <w:kern w:val="0"/>
-          <w:sz w:val="32"/>
-          <w:szCs w:val="22"/>
-          <w:lang w:val="en-US"/>
-          <w14:ligatures w14:val="none"/>
-        </w:rPr>
-      </w:pPr>
-    </w:p>
-    <w:p>
-      <w:pPr>
-        <w:spacing w:after="200" w:line="276" w:lineRule="auto"/>
-        <w:jc w:val="center"/>
-        <w:rPr>
-          <w:rFonts w:ascii="Times New Roman" w:eastAsia="MS Mincho" w:hAnsi="Times New Roman" w:cs="Times New Roman"/>
-          <w:color w:val="000000" w:themeColor="text1"/>
-          <w:kern w:val="0"/>
-          <w:sz w:val="22"/>
-          <w:szCs w:val="22"/>
-          <w:lang w:val="en-US"/>
-          <w14:ligatures w14:val="none"/>
-        </w:rPr>
-      </w:pPr>
-      <w:r>
-        <w:rPr>
-          <w:rFonts w:ascii="Times New Roman" w:eastAsia="MS Mincho" w:hAnsi="Times New Roman" w:cs="Times New Roman"/>
-          <w:b/>
-          <w:color w:val="000000" w:themeColor="text1"/>
-          <w:kern w:val="0"/>
-          <w:sz w:val="32"/>
-          <w:szCs w:val="22"/>
-          <w:lang w:val="en-US"/>
-          <w14:ligatures w14:val="none"/>
-        </w:rPr>
-        <w:t>DECLARATION</w:t>
-      </w:r>
-    </w:p>
-    <w:p>
-      <w:pPr>
-        <w:spacing w:after="100" w:line="276" w:lineRule="auto"/>
-        <w:jc w:val="both"/>
-        <w:rPr>
-          <w:rFonts w:ascii="Times New Roman" w:eastAsia="MS Mincho" w:hAnsi="Times New Roman" w:cs="Times New Roman"/>
-          <w:color w:val="000000" w:themeColor="text1"/>
-          <w:kern w:val="0"/>
-          <w:sz w:val="22"/>
-          <w:szCs w:val="22"/>
-          <w14:ligatures w14:val="none"/>
-        </w:rPr>
-      </w:pPr>
-      <w:r>
-        <w:rPr>
-          <w:rFonts w:ascii="Times New Roman" w:eastAsia="MS Mincho" w:hAnsi="Times New Roman" w:cs="Times New Roman"/>
-          <w:color w:val="000000" w:themeColor="text1"/>
-          <w:kern w:val="0"/>
-          <w:sz w:val="22"/>
-          <w:szCs w:val="22"/>
-          <w14:ligatures w14:val="none"/>
-        </w:rPr>
-        <w:t xml:space="preserve">I, </w:t>
-      </w:r>
-      <w:r>
-        <w:rPr>
-          <w:rFonts w:ascii="Times New Roman" w:eastAsia="MS Mincho" w:hAnsi="Times New Roman" w:cs="Times New Roman"/>
-          <w:b/>
-          <w:bCs/>
-          <w:color w:val="000000" w:themeColor="text1"/>
-          <w:kern w:val="0"/>
-          <w:sz w:val="22"/>
-          <w:szCs w:val="22"/>
-          <w14:ligatures w14:val="none"/>
-        </w:rPr>
-        <w:t>Arpit Saxena</w:t>
-      </w:r>
-      <w:r>
-        <w:rPr>
-          <w:rFonts w:ascii="Times New Roman" w:eastAsia="MS Mincho" w:hAnsi="Times New Roman" w:cs="Times New Roman"/>
-          <w:color w:val="000000" w:themeColor="text1"/>
-          <w:kern w:val="0"/>
-          <w:sz w:val="22"/>
-          <w:szCs w:val="22"/>
-          <w14:ligatures w14:val="none"/>
-        </w:rPr>
-        <w:t xml:space="preserve">, hereby declare that the mini-project entitled </w:t>
-      </w:r>
-      <w:r>
-        <w:rPr>
-          <w:rFonts w:ascii="Times New Roman" w:eastAsia="MS Mincho" w:hAnsi="Times New Roman" w:cs="Times New Roman"/>
-          <w:b/>
-          <w:bCs/>
-          <w:color w:val="000000" w:themeColor="text1"/>
-          <w:kern w:val="0"/>
-          <w:sz w:val="22"/>
-          <w:szCs w:val="22"/>
-          <w14:ligatures w14:val="none"/>
-        </w:rPr>
-        <w:t>“Personal Finance and Expense Analytics System”</w:t>
-      </w:r>
-      <w:r>
-        <w:rPr>
-          <w:rFonts w:ascii="Times New Roman" w:eastAsia="MS Mincho" w:hAnsi="Times New Roman" w:cs="Times New Roman"/>
-          <w:color w:val="000000" w:themeColor="text1"/>
-          <w:kern w:val="0"/>
-          <w:sz w:val="22"/>
-          <w:szCs w:val="22"/>
-          <w14:ligatures w14:val="none"/>
-        </w:rPr>
-        <w:t xml:space="preserve"> is my original academic work, carried out as part of the </w:t>
-      </w:r>
-      <w:r>
-        <w:rPr>
-          <w:rFonts w:ascii="Times New Roman" w:eastAsia="MS Mincho" w:hAnsi="Times New Roman" w:cs="Times New Roman"/>
-          <w:b/>
-          <w:bCs/>
-          <w:color w:val="000000" w:themeColor="text1"/>
-          <w:kern w:val="0"/>
-          <w:sz w:val="22"/>
-          <w:szCs w:val="22"/>
-          <w14:ligatures w14:val="none"/>
-        </w:rPr>
-        <w:t>Master of Computer Applications (MCA) – Data Science, 1st Semester</w:t>
-      </w:r>
-      <w:r>
-        <w:rPr>
-          <w:rFonts w:ascii="Times New Roman" w:eastAsia="MS Mincho" w:hAnsi="Times New Roman" w:cs="Times New Roman"/>
-          <w:color w:val="000000" w:themeColor="text1"/>
-          <w:kern w:val="0"/>
-          <w:sz w:val="22"/>
-          <w:szCs w:val="22"/>
-          <w14:ligatures w14:val="none"/>
-        </w:rPr>
-        <w:t xml:space="preserve"> programme at Chandigarh University, Mohali.</w:t>
-      </w:r>
-    </w:p>
-    <w:p>
-      <w:pPr>
-        <w:spacing w:after="100" w:line="276" w:lineRule="auto"/>
-        <w:jc w:val="both"/>
-        <w:rPr>
-          <w:rFonts w:ascii="Times New Roman" w:eastAsia="MS Mincho" w:hAnsi="Times New Roman" w:cs="Times New Roman"/>
-          <w:color w:val="000000" w:themeColor="text1"/>
-          <w:kern w:val="0"/>
-          <w:sz w:val="22"/>
-          <w:szCs w:val="22"/>
-          <w14:ligatures w14:val="none"/>
-        </w:rPr>
-      </w:pPr>
-      <w:r>
-        <w:rPr>
-          <w:rFonts w:ascii="Times New Roman" w:eastAsia="MS Mincho" w:hAnsi="Times New Roman" w:cs="Times New Roman"/>
-          <w:color w:val="000000" w:themeColor="text1"/>
-          <w:kern w:val="0"/>
-          <w:sz w:val="22"/>
-          <w:szCs w:val="22"/>
-          <w14:ligatures w14:val="none"/>
-        </w:rPr>
-        <w:t xml:space="preserve">The project has been developed as part of the </w:t>
-      </w:r>
-      <w:r>
-        <w:rPr>
-          <w:rFonts w:ascii="Times New Roman" w:eastAsia="MS Mincho" w:hAnsi="Times New Roman" w:cs="Times New Roman"/>
-          <w:b/>
-          <w:bCs/>
-          <w:color w:val="000000" w:themeColor="text1"/>
-          <w:kern w:val="0"/>
-          <w:sz w:val="22"/>
-          <w:szCs w:val="22"/>
-          <w14:ligatures w14:val="none"/>
-        </w:rPr>
-        <w:t>Python Programming Lab</w:t>
-      </w:r>
-      <w:r>
-        <w:rPr>
-          <w:rFonts w:ascii="Times New Roman" w:eastAsia="MS Mincho" w:hAnsi="Times New Roman" w:cs="Times New Roman"/>
-          <w:color w:val="000000" w:themeColor="text1"/>
-          <w:kern w:val="0"/>
-          <w:sz w:val="22"/>
-          <w:szCs w:val="22"/>
-          <w14:ligatures w14:val="none"/>
-        </w:rPr>
-        <w:t xml:space="preserve"> during the academic session </w:t>
-      </w:r>
-      <w:r>
-        <w:rPr>
-          <w:rFonts w:ascii="Times New Roman" w:eastAsia="MS Mincho" w:hAnsi="Times New Roman" w:cs="Times New Roman"/>
-          <w:b/>
-          <w:bCs/>
-          <w:color w:val="000000" w:themeColor="text1"/>
-          <w:kern w:val="0"/>
-          <w:sz w:val="22"/>
-          <w:szCs w:val="22"/>
-          <w14:ligatures w14:val="none"/>
-        </w:rPr>
-        <w:t>2026–2027</w:t>
-      </w:r>
-      <w:r>
-        <w:rPr>
-          <w:rFonts w:ascii="Times New Roman" w:eastAsia="MS Mincho" w:hAnsi="Times New Roman" w:cs="Times New Roman"/>
-          <w:color w:val="000000" w:themeColor="text1"/>
-          <w:kern w:val="0"/>
-          <w:sz w:val="22"/>
-          <w:szCs w:val="22"/>
-          <w14:ligatures w14:val="none"/>
-        </w:rPr>
-        <w:t>. The work presented in this report reflects my understanding and practical application of Python programming, database management, data analytics, and data visualization.</w:t>
-      </w:r>
-    </w:p>
-    <w:p>
-      <w:pPr>
-        <w:spacing w:after="100" w:line="276" w:lineRule="auto"/>
-        <w:jc w:val="both"/>
-        <w:rPr>
-          <w:rFonts w:ascii="Times New Roman" w:eastAsia="MS Mincho" w:hAnsi="Times New Roman" w:cs="Times New Roman"/>
-          <w:color w:val="000000" w:themeColor="text1"/>
-          <w:kern w:val="0"/>
-          <w:sz w:val="22"/>
-          <w:szCs w:val="22"/>
-          <w14:ligatures w14:val="none"/>
-        </w:rPr>
-      </w:pPr>
-      <w:r>
-        <w:rPr>
-          <w:rFonts w:ascii="Times New Roman" w:eastAsia="MS Mincho" w:hAnsi="Times New Roman" w:cs="Times New Roman"/>
-          <w:color w:val="000000" w:themeColor="text1"/>
-          <w:kern w:val="0"/>
-          <w:sz w:val="22"/>
-          <w:szCs w:val="22"/>
-          <w14:ligatures w14:val="none"/>
-        </w:rPr>
-        <w:t xml:space="preserve">I hereby declare that this project report has been prepared for academic purposes and that the work presented is submitted in partial </w:t>
-      </w:r>
-      <w:proofErr w:type="spellStart"/>
-      <w:r>
-        <w:rPr>
-          <w:rFonts w:ascii="Times New Roman" w:eastAsia="MS Mincho" w:hAnsi="Times New Roman" w:cs="Times New Roman"/>
-          <w:color w:val="000000" w:themeColor="text1"/>
-          <w:kern w:val="0"/>
-          <w:sz w:val="22"/>
-          <w:szCs w:val="22"/>
-          <w14:ligatures w14:val="none"/>
-        </w:rPr>
-        <w:t>fulfillment</w:t>
-      </w:r>
-      <w:proofErr w:type="spellEnd"/>
-      <w:r>
-        <w:rPr>
-          <w:rFonts w:ascii="Times New Roman" w:eastAsia="MS Mincho" w:hAnsi="Times New Roman" w:cs="Times New Roman"/>
-          <w:color w:val="000000" w:themeColor="text1"/>
-          <w:kern w:val="0"/>
-          <w:sz w:val="22"/>
-          <w:szCs w:val="22"/>
-          <w14:ligatures w14:val="none"/>
-        </w:rPr>
-        <w:t xml:space="preserve"> of the academic requirements of the MCA (Data Science) programme.</w:t>
-      </w:r>
-    </w:p>
-    <w:p>
-      <w:pPr>
-        <w:spacing w:after="100" w:line="276" w:lineRule="auto"/>
-        <w:rPr>
-          <w:rFonts w:ascii="Times New Roman" w:eastAsia="MS Mincho" w:hAnsi="Times New Roman" w:cs="Times New Roman"/>
-          <w:color w:val="000000" w:themeColor="text1"/>
-          <w:kern w:val="0"/>
-          <w:sz w:val="22"/>
-          <w:szCs w:val="22"/>
-          <w14:ligatures w14:val="none"/>
-        </w:rPr>
-      </w:pPr>
-      <w:r>
-        <w:rPr>
-          <w:rFonts w:ascii="Times New Roman" w:eastAsia="MS Mincho" w:hAnsi="Times New Roman" w:cs="Times New Roman"/>
-          <w:b/>
-          <w:bCs/>
-          <w:color w:val="000000" w:themeColor="text1"/>
-          <w:kern w:val="0"/>
-          <w:sz w:val="22"/>
-          <w:szCs w:val="22"/>
-          <w14:ligatures w14:val="none"/>
-        </w:rPr>
-        <w:t>Student Signature:</w:t>
-      </w:r>
-      <w:r>
-        <w:rPr>
-          <w:rFonts w:ascii="Times New Roman" w:eastAsia="MS Mincho" w:hAnsi="Times New Roman" w:cs="Times New Roman"/>
-          <w:color w:val="000000" w:themeColor="text1"/>
-          <w:kern w:val="0"/>
-          <w:sz w:val="22"/>
-          <w:szCs w:val="22"/>
-          <w14:ligatures w14:val="none"/>
-        </w:rPr>
-        <w:t xml:space="preserve"> __________________________</w:t>
-      </w:r>
-    </w:p>
-    <w:p>
-      <w:pPr>
-        <w:spacing w:after="100" w:line="276" w:lineRule="auto"/>
-        <w:rPr>
-          <w:rFonts w:ascii="Times New Roman" w:eastAsia="MS Mincho" w:hAnsi="Times New Roman" w:cs="Times New Roman"/>
-          <w:color w:val="000000" w:themeColor="text1"/>
-          <w:kern w:val="0"/>
-          <w:sz w:val="22"/>
-          <w:szCs w:val="22"/>
-          <w14:ligatures w14:val="none"/>
-        </w:rPr>
-      </w:pPr>
-      <w:r>
-        <w:rPr>
-          <w:rFonts w:ascii="Times New Roman" w:eastAsia="MS Mincho" w:hAnsi="Times New Roman" w:cs="Times New Roman"/>
-          <w:b/>
-          <w:bCs/>
-          <w:color w:val="000000" w:themeColor="text1"/>
-          <w:kern w:val="0"/>
-          <w:sz w:val="22"/>
-          <w:szCs w:val="22"/>
-          <w14:ligatures w14:val="none"/>
-        </w:rPr>
-        <w:t>Date:</w:t>
-      </w:r>
-      <w:r>
-        <w:rPr>
-          <w:rFonts w:ascii="Times New Roman" w:eastAsia="MS Mincho" w:hAnsi="Times New Roman" w:cs="Times New Roman"/>
-          <w:color w:val="000000" w:themeColor="text1"/>
-          <w:kern w:val="0"/>
-          <w:sz w:val="22"/>
-          <w:szCs w:val="22"/>
-          <w14:ligatures w14:val="none"/>
-        </w:rPr>
-        <w:t xml:space="preserve"> __________________________</w:t>
-      </w:r>
-    </w:p>
-    <w:p>
-      <w:pPr>
-        <w:spacing w:after="100" w:line="276" w:lineRule="auto"/>
-        <w:rPr>
-          <w:rFonts w:ascii="Times New Roman" w:eastAsia="MS Mincho" w:hAnsi="Times New Roman" w:cs="Times New Roman"/>
-          <w:b/>
-          <w:color w:val="000000" w:themeColor="text1"/>
-          <w:kern w:val="0"/>
-          <w:sz w:val="32"/>
-          <w:szCs w:val="22"/>
-          <w:lang w:val="en-US"/>
-          <w14:ligatures w14:val="none"/>
-        </w:rPr>
-      </w:pPr>
-    </w:p>
-    <w:p>
-      <w:pPr>
-        <w:spacing w:after="200" w:line="276" w:lineRule="auto"/>
-        <w:jc w:val="center"/>
-        <w:rPr>
-          <w:rFonts w:ascii="Times New Roman" w:eastAsia="MS Mincho" w:hAnsi="Times New Roman" w:cs="Times New Roman"/>
-          <w:b/>
-          <w:color w:val="000000" w:themeColor="text1"/>
-          <w:kern w:val="0"/>
-          <w:sz w:val="32"/>
-          <w:szCs w:val="22"/>
-          <w:lang w:val="en-US"/>
-          <w14:ligatures w14:val="none"/>
-        </w:rPr>
-      </w:pPr>
-    </w:p>
-    <w:p>
-      <w:pPr>
-        <w:spacing w:after="200" w:line="276" w:lineRule="auto"/>
-        <w:jc w:val="center"/>
-        <w:rPr>
-          <w:rFonts w:ascii="Times New Roman" w:eastAsia="MS Mincho" w:hAnsi="Times New Roman" w:cs="Times New Roman"/>
-          <w:b/>
-          <w:color w:val="000000" w:themeColor="text1"/>
-          <w:kern w:val="0"/>
-          <w:sz w:val="32"/>
-          <w:szCs w:val="22"/>
-          <w:lang w:val="en-US"/>
-          <w14:ligatures w14:val="none"/>
-        </w:rPr>
-      </w:pPr>
-    </w:p>
-    <w:p>
-      <w:pPr>
-        <w:spacing w:after="200" w:line="276" w:lineRule="auto"/>
-        <w:jc w:val="center"/>
-        <w:rPr>
-          <w:rFonts w:ascii="Times New Roman" w:eastAsia="MS Mincho" w:hAnsi="Times New Roman" w:cs="Times New Roman"/>
-          <w:color w:val="000000" w:themeColor="text1"/>
-          <w:kern w:val="0"/>
-          <w:sz w:val="22"/>
-          <w:szCs w:val="22"/>
-          <w:lang w:val="en-US"/>
-          <w14:ligatures w14:val="none"/>
-        </w:rPr>
-      </w:pPr>
-      <w:r>
-        <w:rPr>
-          <w:rFonts w:ascii="Times New Roman" w:eastAsia="MS Mincho" w:hAnsi="Times New Roman" w:cs="Times New Roman"/>
-          <w:b/>
-          <w:color w:val="000000" w:themeColor="text1"/>
-          <w:kern w:val="0"/>
-          <w:sz w:val="32"/>
-          <w:szCs w:val="22"/>
-          <w:lang w:val="en-US"/>
-          <w14:ligatures w14:val="none"/>
-        </w:rPr>
-        <w:lastRenderedPageBreak/>
-        <w:t>ACKNOWLEDGEMENT</w:t>
-      </w:r>
-    </w:p>
-    <w:p>
-      <w:pPr>
-        <w:spacing w:after="200" w:line="276" w:lineRule="auto"/>
-        <w:jc w:val="both"/>
-        <w:rPr>
-          <w:rFonts w:ascii="Times New Roman" w:eastAsia="MS Mincho" w:hAnsi="Times New Roman" w:cs="Times New Roman"/>
-          <w:color w:val="000000" w:themeColor="text1"/>
-          <w:kern w:val="0"/>
-          <w:sz w:val="22"/>
-          <w:szCs w:val="22"/>
-          <w14:ligatures w14:val="none"/>
-        </w:rPr>
-      </w:pPr>
-      <w:r>
-        <w:rPr>
-          <w:rFonts w:ascii="Times New Roman" w:eastAsia="MS Mincho" w:hAnsi="Times New Roman" w:cs="Times New Roman"/>
-          <w:color w:val="000000" w:themeColor="text1"/>
-          <w:kern w:val="0"/>
-          <w:sz w:val="22"/>
-          <w:szCs w:val="22"/>
-          <w14:ligatures w14:val="none"/>
-        </w:rPr>
-        <w:t xml:space="preserve">I would like to express my sincere gratitude to </w:t>
-      </w:r>
-      <w:r>
-        <w:rPr>
-          <w:rFonts w:ascii="Times New Roman" w:eastAsia="MS Mincho" w:hAnsi="Times New Roman" w:cs="Times New Roman"/>
-          <w:b/>
-          <w:bCs/>
-          <w:color w:val="000000" w:themeColor="text1"/>
-          <w:kern w:val="0"/>
-          <w:sz w:val="22"/>
-          <w:szCs w:val="22"/>
-          <w14:ligatures w14:val="none"/>
-        </w:rPr>
-        <w:t>Mr</w:t>
-      </w:r>
-      <w:r>
-        <w:rPr>
-          <w:rFonts w:ascii="Times New Roman" w:eastAsia="MS Mincho" w:hAnsi="Times New Roman" w:cs="Times New Roman"/>
-          <w:b/>
-          <w:bCs/>
-          <w:color w:val="000000" w:themeColor="text1"/>
-          <w:kern w:val="0"/>
-          <w:sz w:val="22"/>
-          <w:szCs w:val="22"/>
-          <w14:ligatures w14:val="none"/>
-        </w:rPr>
-        <w:t>s</w:t>
-      </w:r>
-      <w:r>
-        <w:rPr>
-          <w:rFonts w:ascii="Times New Roman" w:eastAsia="MS Mincho" w:hAnsi="Times New Roman" w:cs="Times New Roman"/>
-          <w:b/>
-          <w:bCs/>
-          <w:color w:val="000000" w:themeColor="text1"/>
-          <w:kern w:val="0"/>
-          <w:sz w:val="22"/>
-          <w:szCs w:val="22"/>
-          <w14:ligatures w14:val="none"/>
-        </w:rPr>
-        <w:t xml:space="preserve">. </w:t>
+        <w:t xml:space="preserve">Mrs. </w:t>
       </w:r>
       <w:proofErr w:type="spellStart"/>
       <w:r>
@@ -6422,6 +6414,7 @@
       <w:r>
         <w:rPr>
           <w:rFonts w:ascii="Times New Roman" w:eastAsia="MS Mincho" w:hAnsi="Times New Roman" w:cs="Times New Roman"/>
+          <w:noProof/>
           <w:color w:val="000000" w:themeColor="text1"/>
           <w:kern w:val="0"/>
           <w:sz w:val="22"/>
@@ -13669,6 +13662,7 @@
       <w:r>
         <w:rPr>
           <w:rFonts w:ascii="Times New Roman" w:eastAsia="MS Mincho" w:hAnsi="Times New Roman" w:cs="Times New Roman"/>
+          <w:noProof/>
           <w:color w:val="000000" w:themeColor="text1"/>
           <w:kern w:val="0"/>
           <w:sz w:val="22"/>
@@ -13799,6 +13793,7 @@
       <w:r>
         <w:rPr>
           <w:rFonts w:ascii="Times New Roman" w:eastAsia="MS Mincho" w:hAnsi="Times New Roman" w:cs="Times New Roman"/>
+          <w:noProof/>
           <w:color w:val="000000" w:themeColor="text1"/>
           <w:kern w:val="0"/>
           <w:sz w:val="22"/>
@@ -13903,6 +13898,7 @@
       <w:r>
         <w:rPr>
           <w:rFonts w:ascii="Times New Roman" w:eastAsia="MS Mincho" w:hAnsi="Times New Roman" w:cs="Times New Roman"/>
+          <w:noProof/>
           <w:color w:val="000000" w:themeColor="text1"/>
           <w:kern w:val="0"/>
           <w:sz w:val="22"/>
@@ -14058,6 +14054,7 @@
       <w:r>
         <w:rPr>
           <w:rFonts w:ascii="Times New Roman" w:eastAsia="MS Mincho" w:hAnsi="Times New Roman" w:cs="Times New Roman"/>
+          <w:noProof/>
           <w:color w:val="000000" w:themeColor="text1"/>
           <w:kern w:val="0"/>
           <w:sz w:val="22"/>
@@ -14187,6 +14184,7 @@
       <w:r>
         <w:rPr>
           <w:rFonts w:ascii="Times New Roman" w:eastAsia="MS Mincho" w:hAnsi="Times New Roman" w:cs="Times New Roman"/>
+          <w:noProof/>
           <w:color w:val="000000" w:themeColor="text1"/>
           <w:kern w:val="0"/>
           <w:sz w:val="22"/>
@@ -14391,9 +14389,9 @@
         </w:rPr>
         <w:lastRenderedPageBreak/>
         <w:drawing>
-          <wp:inline distT="0" distB="0" distL="0" distR="0" wp14:anchorId="559EFDC9" wp14:editId="5B9C5502">
-            <wp:extent cx="5723659" cy="2622011"/>
-            <wp:effectExtent l="19050" t="19050" r="10795" b="26035"/>
+          <wp:inline distT="0" distB="0" distL="0" distR="0" wp14:anchorId="559EFDC9" wp14:editId="43D61070">
+            <wp:extent cx="5976860" cy="2738004"/>
+            <wp:effectExtent l="19050" t="19050" r="24130" b="24765"/>
             <wp:docPr id="1" name="Picture 1"/>
             <wp:cNvGraphicFramePr>
               <a:graphicFrameLocks xmlns:a="http://schemas.openxmlformats.org/drawingml/2006/main" noChangeAspect="1"/>
@@ -14414,7 +14412,7 @@
                   <pic:spPr>
                     <a:xfrm>
                       <a:off x="0" y="0"/>
-                      <a:ext cx="5741937" cy="2630384"/>
+                      <a:ext cx="5993718" cy="2745726"/>
                     </a:xfrm>
                     <a:prstGeom prst="rect">
                       <a:avLst/>
@@ -14528,7 +14526,7 @@
     </w:p>
     <w:p>
       <w:pPr>
-        <w:spacing w:line="276" w:lineRule="auto"/>
+        <w:spacing w:after="0" w:line="276" w:lineRule="auto"/>
         <w:outlineLvl w:val="2"/>
         <w:rPr>
           <w:rFonts w:ascii="Times New Roman" w:eastAsia="Times New Roman" w:hAnsi="Times New Roman" w:cs="Times New Roman"/>
@@ -14648,7 +14646,7 @@
     </w:p>
     <w:p>
       <w:pPr>
-        <w:spacing w:line="276" w:lineRule="auto"/>
+        <w:spacing w:after="0" w:line="276" w:lineRule="auto"/>
         <w:outlineLvl w:val="2"/>
         <w:rPr>
           <w:rFonts w:ascii="Times New Roman" w:eastAsia="Times New Roman" w:hAnsi="Times New Roman" w:cs="Times New Roman"/>
@@ -14702,20 +14700,20 @@
     </w:p>
     <w:p>
       <w:pPr>
+        <w:spacing w:line="276" w:lineRule="auto"/>
+        <w:rPr>
+          <w:rFonts w:ascii="Times New Roman" w:eastAsia="MS Mincho" w:hAnsi="Times New Roman" w:cs="Times New Roman"/>
+          <w:color w:val="000000" w:themeColor="text1"/>
+          <w:kern w:val="0"/>
+          <w:sz w:val="22"/>
+          <w:szCs w:val="22"/>
+          <w14:ligatures w14:val="none"/>
+        </w:rPr>
+      </w:pPr>
+    </w:p>
+    <w:p>
+      <w:pPr>
         <w:spacing w:after="0" w:line="276" w:lineRule="auto"/>
-        <w:rPr>
-          <w:rFonts w:ascii="Times New Roman" w:eastAsia="MS Mincho" w:hAnsi="Times New Roman" w:cs="Times New Roman"/>
-          <w:color w:val="000000" w:themeColor="text1"/>
-          <w:kern w:val="0"/>
-          <w:sz w:val="22"/>
-          <w:szCs w:val="22"/>
-          <w14:ligatures w14:val="none"/>
-        </w:rPr>
-      </w:pPr>
-    </w:p>
-    <w:p>
-      <w:pPr>
-        <w:spacing w:before="240" w:after="0" w:line="276" w:lineRule="auto"/>
         <w:rPr>
           <w:rFonts w:ascii="Times New Roman" w:eastAsia="MS Mincho" w:hAnsi="Times New Roman" w:cs="Times New Roman"/>
           <w:b/>
@@ -14740,7 +14738,35 @@
           <w:lang w:val="en-US"/>
           <w14:ligatures w14:val="none"/>
         </w:rPr>
-        <w:t>17. REFERENCES</w:t>
+        <w:t>1</w:t>
+      </w:r>
+      <w:r>
+        <w:rPr>
+          <w:rFonts w:ascii="Times New Roman" w:eastAsia="MS Mincho" w:hAnsi="Times New Roman" w:cs="Times New Roman"/>
+          <w:b/>
+          <w:bCs/>
+          <w:color w:val="000000" w:themeColor="text1"/>
+          <w:kern w:val="0"/>
+          <w:sz w:val="32"/>
+          <w:szCs w:val="22"/>
+          <w:lang w:val="en-US"/>
+          <w14:ligatures w14:val="none"/>
+        </w:rPr>
+        <w:t>6</w:t>
+      </w:r>
+      <w:r>
+        <w:rPr>
+          <w:rFonts w:ascii="Times New Roman" w:eastAsia="MS Mincho" w:hAnsi="Times New Roman" w:cs="Times New Roman"/>
+          <w:b/>
+          <w:bCs/>
+          <w:color w:val="000000" w:themeColor="text1"/>
+          <w:kern w:val="0"/>
+          <w:sz w:val="32"/>
+          <w:szCs w:val="22"/>
+          <w:lang w:val="en-US"/>
+          <w14:ligatures w14:val="none"/>
+        </w:rPr>
+        <w:t>. REFERENCES</w:t>
       </w:r>
     </w:p>
     <w:p>
@@ -14749,7 +14775,7 @@
           <w:ilvl w:val="0"/>
           <w:numId w:val="14"/>
         </w:numPr>
-        <w:spacing w:before="240" w:line="276" w:lineRule="auto"/>
+        <w:spacing w:after="0" w:line="240" w:lineRule="auto"/>
         <w:rPr>
           <w:rFonts w:ascii="Times New Roman" w:eastAsia="MS Mincho" w:hAnsi="Times New Roman" w:cs="Times New Roman"/>
           <w:color w:val="000000" w:themeColor="text1"/>
@@ -14815,7 +14841,7 @@
           <w:ilvl w:val="0"/>
           <w:numId w:val="14"/>
         </w:numPr>
-        <w:spacing w:before="240" w:line="276" w:lineRule="auto"/>
+        <w:spacing w:after="0" w:line="240" w:lineRule="auto"/>
         <w:rPr>
           <w:rFonts w:ascii="Times New Roman" w:eastAsia="MS Mincho" w:hAnsi="Times New Roman" w:cs="Times New Roman"/>
           <w:color w:val="000000" w:themeColor="text1"/>
@@ -14881,7 +14907,7 @@
           <w:ilvl w:val="0"/>
           <w:numId w:val="14"/>
         </w:numPr>
-        <w:spacing w:before="240" w:line="276" w:lineRule="auto"/>
+        <w:spacing w:after="0" w:line="240" w:lineRule="auto"/>
         <w:rPr>
           <w:rFonts w:ascii="Times New Roman" w:eastAsia="MS Mincho" w:hAnsi="Times New Roman" w:cs="Times New Roman"/>
           <w:color w:val="000000" w:themeColor="text1"/>
@@ -14947,26 +14973,25 @@
           <w:ilvl w:val="0"/>
           <w:numId w:val="14"/>
         </w:numPr>
-        <w:spacing w:before="240" w:line="276" w:lineRule="auto"/>
-        <w:rPr>
-          <w:rFonts w:ascii="Times New Roman" w:eastAsia="MS Mincho" w:hAnsi="Times New Roman" w:cs="Times New Roman"/>
-          <w:color w:val="000000" w:themeColor="text1"/>
-          <w:kern w:val="0"/>
-          <w:sz w:val="22"/>
-          <w:szCs w:val="22"/>
-          <w14:ligatures w14:val="none"/>
-        </w:rPr>
-      </w:pPr>
-      <w:r>
-        <w:rPr>
-          <w:rFonts w:ascii="Times New Roman" w:eastAsia="MS Mincho" w:hAnsi="Times New Roman" w:cs="Times New Roman"/>
-          <w:color w:val="000000" w:themeColor="text1"/>
-          <w:kern w:val="0"/>
-          <w:sz w:val="22"/>
-          <w:szCs w:val="22"/>
-          <w14:ligatures w14:val="none"/>
-        </w:rPr>
-        <w:lastRenderedPageBreak/>
+        <w:spacing w:after="0" w:line="240" w:lineRule="auto"/>
+        <w:rPr>
+          <w:rFonts w:ascii="Times New Roman" w:eastAsia="MS Mincho" w:hAnsi="Times New Roman" w:cs="Times New Roman"/>
+          <w:color w:val="000000" w:themeColor="text1"/>
+          <w:kern w:val="0"/>
+          <w:sz w:val="22"/>
+          <w:szCs w:val="22"/>
+          <w14:ligatures w14:val="none"/>
+        </w:rPr>
+      </w:pPr>
+      <w:r>
+        <w:rPr>
+          <w:rFonts w:ascii="Times New Roman" w:eastAsia="MS Mincho" w:hAnsi="Times New Roman" w:cs="Times New Roman"/>
+          <w:color w:val="000000" w:themeColor="text1"/>
+          <w:kern w:val="0"/>
+          <w:sz w:val="22"/>
+          <w:szCs w:val="22"/>
+          <w14:ligatures w14:val="none"/>
+        </w:rPr>
         <w:t xml:space="preserve">NumPy Developers, </w:t>
       </w:r>
       <w:r>
@@ -15014,7 +15039,7 @@
           <w:ilvl w:val="0"/>
           <w:numId w:val="14"/>
         </w:numPr>
-        <w:spacing w:before="240" w:line="276" w:lineRule="auto"/>
+        <w:spacing w:after="0" w:line="240" w:lineRule="auto"/>
         <w:rPr>
           <w:rFonts w:ascii="Times New Roman" w:eastAsia="MS Mincho" w:hAnsi="Times New Roman" w:cs="Times New Roman"/>
           <w:color w:val="000000" w:themeColor="text1"/>
@@ -15080,7 +15105,7 @@
           <w:ilvl w:val="0"/>
           <w:numId w:val="14"/>
         </w:numPr>
-        <w:spacing w:before="240" w:line="276" w:lineRule="auto"/>
+        <w:spacing w:after="0" w:line="240" w:lineRule="auto"/>
         <w:rPr>
           <w:rFonts w:ascii="Times New Roman" w:eastAsia="MS Mincho" w:hAnsi="Times New Roman" w:cs="Times New Roman"/>
           <w:color w:val="000000" w:themeColor="text1"/>
@@ -15189,7 +15214,7 @@
           <w:ilvl w:val="0"/>
           <w:numId w:val="14"/>
         </w:numPr>
-        <w:spacing w:before="240" w:line="276" w:lineRule="auto"/>
+        <w:spacing w:after="0" w:line="240" w:lineRule="auto"/>
         <w:rPr>
           <w:rFonts w:ascii="Times New Roman" w:eastAsia="MS Mincho" w:hAnsi="Times New Roman" w:cs="Times New Roman"/>
           <w:color w:val="000000" w:themeColor="text1"/>
@@ -17806,7 +17831,6 @@
     <w:next w:val="Normal"/>
     <w:link w:val="Heading2Char"/>
     <w:uiPriority w:val="9"/>
-    <w:semiHidden/>
     <w:unhideWhenUsed/>
     <w:qFormat/>
     <w:rsid w:val="005B01BB"/>
@@ -18021,7 +18045,6 @@
     <w:basedOn w:val="DefaultParagraphFont"/>
     <w:link w:val="Heading2"/>
     <w:uiPriority w:val="9"/>
-    <w:semiHidden/>
     <w:rsid w:val="005B01BB"/>
     <w:rPr>
       <w:rFonts w:asciiTheme="majorHAnsi" w:eastAsiaTheme="majorEastAsia" w:hAnsiTheme="majorHAnsi" w:cstheme="majorBidi"/>

</xml_diff>